<commit_message>
Segunda rodada de revisão: figuras, notas, verificação factual e sumário
- Recria a Figura 5.3; corrige as Figuras 5.2 (VPL e TIR) e 1.1 (Classe 3)
- Acrescenta nota de exemplos independentes, cautela sobre cálculos de LLM,
  instrução de fórmulas nos prompts do Capítulo 5 e nota sobre saídas de LLM
- Reverte ajuste indevido da McKinsey e retira atribuição não verificada do FEL
- Marca o arquivo para atualização do sumário ao abrir no Word
- Atualiza o relatório

Co-Authored-By: Claude Sonnet 5.5 <noreply@anthropic.com>
Claude-Session: https://claude.ai/code/session_01QyVuLhMLANWbd77ToAWS1S
</commit_message>
<xml_diff>
--- a/revisao_editorial/Relatorio_Revisao_e_Parecer.docx
+++ b/revisao_editorial/Relatorio_Revisao_e_Parecer.docx
@@ -157,7 +157,7 @@
           <w:sz w:val="22"/>
           <w:szCs w:val="22"/>
         </w:rPr>
-        <w:t xml:space="preserve">com o critério usado, as correções de conteúdo, as verificações externas, as pendências que dependem de você e o parecer sobre a publicação.</w:t>
+        <w:t xml:space="preserve">com o critério usado, as correções de conteúdo, as verificações externas, o que ainda depende de você e o parecer sobre a publicação.</w:t>
       </w:r>
     </w:p>
     <w:p>
@@ -180,7 +180,7 @@
           <w:sz w:val="22"/>
           <w:szCs w:val="22"/>
         </w:rPr>
-        <w:t xml:space="preserve">Foram eliminadas todas as ocorrências de travessão: 207 travessões longos, 3 meios-travessões e cerca de 210 hífens com espaços usados como travessão, além de 30 marcadores de lista digitados com hífen, trocados por marcadores tipográficos. Restam zero no texto. No total, 510 parágrafos foram alterados (cerca de 26% dos parágrafos com texto), 4 parágrafos redundantes foram consolidados, 10 siglas foram acrescentadas ao glossário e 3 figuras tiveram o travessão removido da própria imagem.</w:t>
+        <w:t xml:space="preserve">Foram eliminadas todas as ocorrências de travessão: 207 travessões longos, 3 meios-travessões e cerca de 210 hífens com espaços usados como travessão, além de 30 marcadores de lista digitados com hífen, trocados por marcadores tipográficos. Restam zero no texto. No total, 515 parágrafos foram alterados (cerca de 26% dos parágrafos com texto), 4 parágrafos redundantes foram consolidados, 2 parágrafos novos foram acrescentados (nota sobre saídas de LLM e cautela sobre cálculos), 10 siglas entraram no glossário e 5 figuras foram corrigidas ou recriadas.</w:t>
       </w:r>
     </w:p>
     <w:p>
@@ -203,7 +203,7 @@
           <w:sz w:val="22"/>
           <w:szCs w:val="22"/>
         </w:rPr>
-        <w:t xml:space="preserve">A obra continua atual e faz sentido publicar, desde que você feche antes as pendências factuais e de figuras da seção 6 e decida como tratar o conteúdo que envelhece rápido (seção 7).</w:t>
+        <w:t xml:space="preserve">A obra continua atual e faz sentido publicar, desde que você feche antes as pendências que restam na seção 6 e decida como tratar o conteúdo que envelhece rápido (seção 7).</w:t>
       </w:r>
     </w:p>
     <w:p>
@@ -1779,7 +1779,7 @@
           <w:sz w:val="22"/>
           <w:szCs w:val="22"/>
         </w:rPr>
-        <w:t xml:space="preserve">Imagens não são editáveis no Word. Corrigi diretamente nos arquivos de imagem os travessões da Figura 4.1 ("OpenAI – 1,5B parâmetros" e "OpenAI – 175B parâmetros", agora com vírgula), da Figura 5.2 ("FEL 1 –", agora "FEL 1:") e da Figura 6.3 (cabeçalhos de linha, como "FEL 1 –", agora sem o travessão e com o texto recentralizado). A Figura 5.3 (painel de controle) ainda tem um hífen no título e outros problemas, descritos na seção 6.</w:t>
+        <w:t xml:space="preserve">Imagens não são editáveis no Word. Corrigi diretamente nos arquivos de imagem os travessões da Figura 4.1 ("OpenAI – 1,5B parâmetros" e "OpenAI – 175B parâmetros", agora com vírgula), da Figura 5.2 ("FEL 1 –", agora "FEL 1:") e da Figura 6.3 (cabeçalhos de linha, como "FEL 1 –", agora sem o travessão e com o texto recentralizado). A Figura 5.3 foi recriada por inteiro (ver seção 5), sem travessões.</w:t>
       </w:r>
     </w:p>
     <w:p>
@@ -3921,7 +3921,7 @@
                 <w:sz w:val="19"/>
                 <w:szCs w:val="19"/>
               </w:rPr>
-              <w:t xml:space="preserve">O texto citava SPI 0,87, desvio de custo de 14,3%, EAC de R$ 134,8 Mi e níveis de confiança que não aparecem no painel (que mostra SPI 0,88, variação de custo de R$ 8,0 MM, EAC de R$ 130,4 MM)</w:t>
+              <w:t xml:space="preserve">O painel original tinha marcadores não preenchidos ("[ANO]", "[Código de cor Amarelo]"), erros de português nas ações do gerente, "Pacote D" duplicado e "Prob. 32%" repetido; o texto citava SPI 0,87, desvio de custo de 14,3%, EAC de R$ 134,8 Mi e níveis de confiança que não apareciam na imagem; e o texto mencionava um "Prompt de Controle Diário" na parte inferior que a imagem não tinha</w:t>
             </w:r>
           </w:p>
         </w:tc>
@@ -3954,7 +3954,7 @@
                 <w:sz w:val="19"/>
                 <w:szCs w:val="19"/>
               </w:rPr>
-              <w:t xml:space="preserve">Texto alinhado aos valores do painel; as porcentagens de confiança foram retiradas</w:t>
+              <w:t xml:space="preserve">Figura recriada em escala de cinza, com valores internamente coerentes (SPI 0,88, CPI 0,92, SV de menos R$ 12,5 MM, CV de menos R$ 8,0 MM, EAC de R$ 130,4 MM, VAC de menos R$ 10,4 MM, atraso de 23 dias) e com o bloco do prompt. O texto foi alinhado a esses valores e as porcentagens de confiança saíram. A rotação de 90 graus que você usava na página foi mantida</w:t>
             </w:r>
           </w:p>
         </w:tc>
@@ -3992,7 +3992,7 @@
                 <w:sz w:val="19"/>
                 <w:szCs w:val="19"/>
               </w:rPr>
-              <w:t xml:space="preserve">Figura 6.1 e texto do Capítulo 6</w:t>
+              <w:t xml:space="preserve">Figura 5.2</w:t>
             </w:r>
           </w:p>
         </w:tc>
@@ -4025,7 +4025,7 @@
                 <w:sz w:val="19"/>
                 <w:szCs w:val="19"/>
               </w:rPr>
-              <w:t xml:space="preserve">O texto dizia que, no Encerramento, as curvas "convergem" (7 e 6)</w:t>
+              <w:t xml:space="preserve">Usava NPV e IRR, enquanto o texto usa VPL e TIR</w:t>
             </w:r>
           </w:p>
         </w:tc>
@@ -4058,7 +4058,7 @@
                 <w:sz w:val="19"/>
                 <w:szCs w:val="19"/>
               </w:rPr>
-              <w:t xml:space="preserve">Passou a "se aproximam de um equilíbrio moderado"</w:t>
+              <w:t xml:space="preserve">Trocado na imagem por VPL e TIR</w:t>
             </w:r>
           </w:p>
         </w:tc>
@@ -4096,7 +4096,7 @@
                 <w:sz w:val="19"/>
                 <w:szCs w:val="19"/>
               </w:rPr>
-              <w:t xml:space="preserve">Capítulo 4, Figura 4.2</w:t>
+              <w:t xml:space="preserve">Figura 1.1</w:t>
             </w:r>
           </w:p>
         </w:tc>
@@ -4129,7 +4129,7 @@
                 <w:sz w:val="19"/>
                 <w:szCs w:val="19"/>
               </w:rPr>
-              <w:t xml:space="preserve">As referências Chiang et al. (2024) e Liang et al. (2025) estavam na lista, mas não eram citadas no texto</w:t>
+              <w:t xml:space="preserve">A Fase 3 mostrava "Estimativas Classe 2", enquanto a Tabela 1.3 trata a Classe 3 como padrão do FEL 3 (com possível evolução para a Classe 2)</w:t>
             </w:r>
           </w:p>
         </w:tc>
@@ -4162,7 +4162,7 @@
                 <w:sz w:val="19"/>
                 <w:szCs w:val="19"/>
               </w:rPr>
-              <w:t xml:space="preserve">Inseri a citação na frase sobre comparações entre modelos</w:t>
+              <w:t xml:space="preserve">Imagem alterada para "Classe 3"</w:t>
             </w:r>
           </w:p>
         </w:tc>
@@ -4200,7 +4200,7 @@
                 <w:sz w:val="19"/>
                 <w:szCs w:val="19"/>
               </w:rPr>
-              <w:t xml:space="preserve">Persons on Board</w:t>
+              <w:t xml:space="preserve">Disclaimer</w:t>
             </w:r>
           </w:p>
         </w:tc>
@@ -4233,7 +4233,7 @@
                 <w:sz w:val="19"/>
                 <w:szCs w:val="19"/>
               </w:rPr>
-              <w:t xml:space="preserve">Glossário usa "Persons on Board", capítulos usavam "Personnel on Board"</w:t>
+              <w:t xml:space="preserve">Exemplos de projetos parecidos têm valores diferentes (parque eólico de 150 MW com BAC de R$ 680 milhões no Prompt 5.4 e CAPEX de R$ 900 milhões no 6.5)</w:t>
             </w:r>
           </w:p>
         </w:tc>
@@ -4266,7 +4266,7 @@
                 <w:sz w:val="19"/>
                 <w:szCs w:val="19"/>
               </w:rPr>
-              <w:t xml:space="preserve">Unificado</w:t>
+              <w:t xml:space="preserve">Frase acrescentada dizendo que os exemplos são independentes entre si</w:t>
             </w:r>
           </w:p>
         </w:tc>
@@ -4304,7 +4304,7 @@
                 <w:sz w:val="19"/>
                 <w:szCs w:val="19"/>
               </w:rPr>
-              <w:t xml:space="preserve">Glossário</w:t>
+              <w:t xml:space="preserve">Cálculos feitos por LLM (Capítulos 4 e 5)</w:t>
             </w:r>
           </w:p>
         </w:tc>
@@ -4337,7 +4337,7 @@
                 <w:sz w:val="19"/>
                 <w:szCs w:val="19"/>
               </w:rPr>
-              <w:t xml:space="preserve">Fora de ordem alfabética (FEED e HAZOP no topo); siglas usadas e não definidas</w:t>
+              <w:t xml:space="preserve">O livro não alertava de forma explícita que modelos erram aritmética</w:t>
             </w:r>
           </w:p>
         </w:tc>
@@ -4370,7 +4370,7 @@
                 <w:sz w:val="19"/>
                 <w:szCs w:val="19"/>
               </w:rPr>
-              <w:t xml:space="preserve">Reordenado; acrescentadas AC, ANTT, E&amp;P, EPCM, EV, P50/P75/P90, PQR, PV, TCPI e WPS</w:t>
+              <w:t xml:space="preserve">Parágrafo de cautela no fim do Capítulo 4 e, em cada prompt do Capítulo 5, instrução para mostrar fórmulas e passos intermediários, a fim de recalcular em planilha</w:t>
             </w:r>
           </w:p>
         </w:tc>
@@ -4408,7 +4408,7 @@
                 <w:sz w:val="19"/>
                 <w:szCs w:val="19"/>
               </w:rPr>
-              <w:t xml:space="preserve">Referências</w:t>
+              <w:t xml:space="preserve">Saídas de LLM (Capítulo 6)</w:t>
             </w:r>
           </w:p>
         </w:tc>
@@ -4441,7 +4441,7 @@
                 <w:sz w:val="19"/>
                 <w:szCs w:val="19"/>
               </w:rPr>
-              <w:t xml:space="preserve">Ordem alfabética quebrada após padronizar autores institucionais</w:t>
+              <w:t xml:space="preserve">Não havia aviso geral de que as respostas variam e de que foram geradas em data e modelo específicos</w:t>
             </w:r>
           </w:p>
         </w:tc>
@@ -4474,7 +4474,7 @@
                 <w:sz w:val="19"/>
                 <w:szCs w:val="19"/>
               </w:rPr>
-              <w:t xml:space="preserve">Reordenadas</w:t>
+              <w:t xml:space="preserve">Nota acrescentada antes do Prompt 6.1, com um campo para você informar a versão do modelo</w:t>
             </w:r>
           </w:p>
         </w:tc>
@@ -4512,7 +4512,7 @@
                 <w:sz w:val="19"/>
                 <w:szCs w:val="19"/>
               </w:rPr>
-              <w:t xml:space="preserve">Cabeçalho do Capítulo 4</w:t>
+              <w:t xml:space="preserve">Figura 6.1 e texto do Capítulo 6</w:t>
             </w:r>
           </w:p>
         </w:tc>
@@ -4545,7 +4545,7 @@
                 <w:sz w:val="19"/>
                 <w:szCs w:val="19"/>
               </w:rPr>
-              <w:t xml:space="preserve">"GESTORES DE PROJETO", diferente do título do capítulo</w:t>
+              <w:t xml:space="preserve">O texto dizia que, no Encerramento, as curvas "convergem" (7 e 6)</w:t>
             </w:r>
           </w:p>
         </w:tc>
@@ -4578,7 +4578,7 @@
                 <w:sz w:val="19"/>
                 <w:szCs w:val="19"/>
               </w:rPr>
-              <w:t xml:space="preserve">Corrigido para "PROJETOS"</w:t>
+              <w:t xml:space="preserve">Passou a "se aproximam de um equilíbrio moderado"</w:t>
             </w:r>
           </w:p>
         </w:tc>
@@ -4616,6 +4616,526 @@
                 <w:sz w:val="19"/>
                 <w:szCs w:val="19"/>
               </w:rPr>
+              <w:t xml:space="preserve">Capítulo 4, Figura 4.2</w:t>
+            </w:r>
+          </w:p>
+        </w:tc>
+        <w:tc>
+          <w:tcPr>
+            <w:tcW w:type="dxa" w:w="4000"/>
+            <w:tcBorders>
+              <w:top w:val="single" w:color="BFBFBF" w:sz="4"/>
+              <w:left w:val="single" w:color="BFBFBF" w:sz="4"/>
+              <w:bottom w:val="single" w:color="BFBFBF" w:sz="4"/>
+              <w:right w:val="single" w:color="BFBFBF" w:sz="4"/>
+            </w:tcBorders>
+            <w:tcMar>
+              <w:top w:type="dxa" w:w="70"/>
+              <w:left w:type="dxa" w:w="100"/>
+              <w:bottom w:type="dxa" w:w="70"/>
+              <w:right w:type="dxa" w:w="100"/>
+            </w:tcMar>
+          </w:tcPr>
+          <w:p>
+            <w:pPr>
+              <w:spacing w:after="40"/>
+            </w:pPr>
+            <w:r>
+              <w:rPr>
+                <w:rFonts w:ascii="Calibri" w:cs="Calibri" w:eastAsia="Calibri" w:hAnsi="Calibri"/>
+                <w:b w:val="false"/>
+                <w:bCs w:val="false"/>
+                <w:color w:val="000000"/>
+                <w:sz w:val="19"/>
+                <w:szCs w:val="19"/>
+              </w:rPr>
+              <w:t xml:space="preserve">As referências Chiang et al. (2024) e Liang et al. (2025) estavam na lista, mas não eram citadas no texto</w:t>
+            </w:r>
+          </w:p>
+        </w:tc>
+        <w:tc>
+          <w:tcPr>
+            <w:tcW w:type="dxa" w:w="2938"/>
+            <w:tcBorders>
+              <w:top w:val="single" w:color="BFBFBF" w:sz="4"/>
+              <w:left w:val="single" w:color="BFBFBF" w:sz="4"/>
+              <w:bottom w:val="single" w:color="BFBFBF" w:sz="4"/>
+              <w:right w:val="single" w:color="BFBFBF" w:sz="4"/>
+            </w:tcBorders>
+            <w:tcMar>
+              <w:top w:type="dxa" w:w="70"/>
+              <w:left w:type="dxa" w:w="100"/>
+              <w:bottom w:type="dxa" w:w="70"/>
+              <w:right w:type="dxa" w:w="100"/>
+            </w:tcMar>
+          </w:tcPr>
+          <w:p>
+            <w:pPr>
+              <w:spacing w:after="40"/>
+            </w:pPr>
+            <w:r>
+              <w:rPr>
+                <w:rFonts w:ascii="Calibri" w:cs="Calibri" w:eastAsia="Calibri" w:hAnsi="Calibri"/>
+                <w:b w:val="false"/>
+                <w:bCs w:val="false"/>
+                <w:color w:val="000000"/>
+                <w:sz w:val="19"/>
+                <w:szCs w:val="19"/>
+              </w:rPr>
+              <w:t xml:space="preserve">Inseri a citação na frase sobre comparações entre modelos</w:t>
+            </w:r>
+          </w:p>
+        </w:tc>
+      </w:tr>
+      <w:tr>
+        <w:trPr>
+          <w:cantSplit/>
+        </w:trPr>
+        <w:tc>
+          <w:tcPr>
+            <w:tcW w:type="dxa" w:w="2700"/>
+            <w:tcBorders>
+              <w:top w:val="single" w:color="BFBFBF" w:sz="4"/>
+              <w:left w:val="single" w:color="BFBFBF" w:sz="4"/>
+              <w:bottom w:val="single" w:color="BFBFBF" w:sz="4"/>
+              <w:right w:val="single" w:color="BFBFBF" w:sz="4"/>
+            </w:tcBorders>
+            <w:tcMar>
+              <w:top w:type="dxa" w:w="70"/>
+              <w:left w:type="dxa" w:w="100"/>
+              <w:bottom w:type="dxa" w:w="70"/>
+              <w:right w:type="dxa" w:w="100"/>
+            </w:tcMar>
+          </w:tcPr>
+          <w:p>
+            <w:pPr>
+              <w:spacing w:after="40"/>
+            </w:pPr>
+            <w:r>
+              <w:rPr>
+                <w:rFonts w:ascii="Calibri" w:cs="Calibri" w:eastAsia="Calibri" w:hAnsi="Calibri"/>
+                <w:b w:val="false"/>
+                <w:bCs w:val="false"/>
+                <w:color w:val="000000"/>
+                <w:sz w:val="19"/>
+                <w:szCs w:val="19"/>
+              </w:rPr>
+              <w:t xml:space="preserve">Persons on Board</w:t>
+            </w:r>
+          </w:p>
+        </w:tc>
+        <w:tc>
+          <w:tcPr>
+            <w:tcW w:type="dxa" w:w="4000"/>
+            <w:tcBorders>
+              <w:top w:val="single" w:color="BFBFBF" w:sz="4"/>
+              <w:left w:val="single" w:color="BFBFBF" w:sz="4"/>
+              <w:bottom w:val="single" w:color="BFBFBF" w:sz="4"/>
+              <w:right w:val="single" w:color="BFBFBF" w:sz="4"/>
+            </w:tcBorders>
+            <w:tcMar>
+              <w:top w:type="dxa" w:w="70"/>
+              <w:left w:type="dxa" w:w="100"/>
+              <w:bottom w:type="dxa" w:w="70"/>
+              <w:right w:type="dxa" w:w="100"/>
+            </w:tcMar>
+          </w:tcPr>
+          <w:p>
+            <w:pPr>
+              <w:spacing w:after="40"/>
+            </w:pPr>
+            <w:r>
+              <w:rPr>
+                <w:rFonts w:ascii="Calibri" w:cs="Calibri" w:eastAsia="Calibri" w:hAnsi="Calibri"/>
+                <w:b w:val="false"/>
+                <w:bCs w:val="false"/>
+                <w:color w:val="000000"/>
+                <w:sz w:val="19"/>
+                <w:szCs w:val="19"/>
+              </w:rPr>
+              <w:t xml:space="preserve">Glossário usa "Persons on Board", capítulos usavam "Personnel on Board"</w:t>
+            </w:r>
+          </w:p>
+        </w:tc>
+        <w:tc>
+          <w:tcPr>
+            <w:tcW w:type="dxa" w:w="2938"/>
+            <w:tcBorders>
+              <w:top w:val="single" w:color="BFBFBF" w:sz="4"/>
+              <w:left w:val="single" w:color="BFBFBF" w:sz="4"/>
+              <w:bottom w:val="single" w:color="BFBFBF" w:sz="4"/>
+              <w:right w:val="single" w:color="BFBFBF" w:sz="4"/>
+            </w:tcBorders>
+            <w:tcMar>
+              <w:top w:type="dxa" w:w="70"/>
+              <w:left w:type="dxa" w:w="100"/>
+              <w:bottom w:type="dxa" w:w="70"/>
+              <w:right w:type="dxa" w:w="100"/>
+            </w:tcMar>
+          </w:tcPr>
+          <w:p>
+            <w:pPr>
+              <w:spacing w:after="40"/>
+            </w:pPr>
+            <w:r>
+              <w:rPr>
+                <w:rFonts w:ascii="Calibri" w:cs="Calibri" w:eastAsia="Calibri" w:hAnsi="Calibri"/>
+                <w:b w:val="false"/>
+                <w:bCs w:val="false"/>
+                <w:color w:val="000000"/>
+                <w:sz w:val="19"/>
+                <w:szCs w:val="19"/>
+              </w:rPr>
+              <w:t xml:space="preserve">Unificado</w:t>
+            </w:r>
+          </w:p>
+        </w:tc>
+      </w:tr>
+      <w:tr>
+        <w:trPr>
+          <w:cantSplit/>
+        </w:trPr>
+        <w:tc>
+          <w:tcPr>
+            <w:tcW w:type="dxa" w:w="2700"/>
+            <w:tcBorders>
+              <w:top w:val="single" w:color="BFBFBF" w:sz="4"/>
+              <w:left w:val="single" w:color="BFBFBF" w:sz="4"/>
+              <w:bottom w:val="single" w:color="BFBFBF" w:sz="4"/>
+              <w:right w:val="single" w:color="BFBFBF" w:sz="4"/>
+            </w:tcBorders>
+            <w:tcMar>
+              <w:top w:type="dxa" w:w="70"/>
+              <w:left w:type="dxa" w:w="100"/>
+              <w:bottom w:type="dxa" w:w="70"/>
+              <w:right w:type="dxa" w:w="100"/>
+            </w:tcMar>
+          </w:tcPr>
+          <w:p>
+            <w:pPr>
+              <w:spacing w:after="40"/>
+            </w:pPr>
+            <w:r>
+              <w:rPr>
+                <w:rFonts w:ascii="Calibri" w:cs="Calibri" w:eastAsia="Calibri" w:hAnsi="Calibri"/>
+                <w:b w:val="false"/>
+                <w:bCs w:val="false"/>
+                <w:color w:val="000000"/>
+                <w:sz w:val="19"/>
+                <w:szCs w:val="19"/>
+              </w:rPr>
+              <w:t xml:space="preserve">Glossário</w:t>
+            </w:r>
+          </w:p>
+        </w:tc>
+        <w:tc>
+          <w:tcPr>
+            <w:tcW w:type="dxa" w:w="4000"/>
+            <w:tcBorders>
+              <w:top w:val="single" w:color="BFBFBF" w:sz="4"/>
+              <w:left w:val="single" w:color="BFBFBF" w:sz="4"/>
+              <w:bottom w:val="single" w:color="BFBFBF" w:sz="4"/>
+              <w:right w:val="single" w:color="BFBFBF" w:sz="4"/>
+            </w:tcBorders>
+            <w:tcMar>
+              <w:top w:type="dxa" w:w="70"/>
+              <w:left w:type="dxa" w:w="100"/>
+              <w:bottom w:type="dxa" w:w="70"/>
+              <w:right w:type="dxa" w:w="100"/>
+            </w:tcMar>
+          </w:tcPr>
+          <w:p>
+            <w:pPr>
+              <w:spacing w:after="40"/>
+            </w:pPr>
+            <w:r>
+              <w:rPr>
+                <w:rFonts w:ascii="Calibri" w:cs="Calibri" w:eastAsia="Calibri" w:hAnsi="Calibri"/>
+                <w:b w:val="false"/>
+                <w:bCs w:val="false"/>
+                <w:color w:val="000000"/>
+                <w:sz w:val="19"/>
+                <w:szCs w:val="19"/>
+              </w:rPr>
+              <w:t xml:space="preserve">Fora de ordem alfabética (FEED e HAZOP no topo); siglas usadas e não definidas</w:t>
+            </w:r>
+          </w:p>
+        </w:tc>
+        <w:tc>
+          <w:tcPr>
+            <w:tcW w:type="dxa" w:w="2938"/>
+            <w:tcBorders>
+              <w:top w:val="single" w:color="BFBFBF" w:sz="4"/>
+              <w:left w:val="single" w:color="BFBFBF" w:sz="4"/>
+              <w:bottom w:val="single" w:color="BFBFBF" w:sz="4"/>
+              <w:right w:val="single" w:color="BFBFBF" w:sz="4"/>
+            </w:tcBorders>
+            <w:tcMar>
+              <w:top w:type="dxa" w:w="70"/>
+              <w:left w:type="dxa" w:w="100"/>
+              <w:bottom w:type="dxa" w:w="70"/>
+              <w:right w:type="dxa" w:w="100"/>
+            </w:tcMar>
+          </w:tcPr>
+          <w:p>
+            <w:pPr>
+              <w:spacing w:after="40"/>
+            </w:pPr>
+            <w:r>
+              <w:rPr>
+                <w:rFonts w:ascii="Calibri" w:cs="Calibri" w:eastAsia="Calibri" w:hAnsi="Calibri"/>
+                <w:b w:val="false"/>
+                <w:bCs w:val="false"/>
+                <w:color w:val="000000"/>
+                <w:sz w:val="19"/>
+                <w:szCs w:val="19"/>
+              </w:rPr>
+              <w:t xml:space="preserve">Reordenado; acrescentadas AC, ANTT, E&amp;P, EPCM, EV, P50/P75/P90, PQR, PV, TCPI e WPS</w:t>
+            </w:r>
+          </w:p>
+        </w:tc>
+      </w:tr>
+      <w:tr>
+        <w:trPr>
+          <w:cantSplit/>
+        </w:trPr>
+        <w:tc>
+          <w:tcPr>
+            <w:tcW w:type="dxa" w:w="2700"/>
+            <w:tcBorders>
+              <w:top w:val="single" w:color="BFBFBF" w:sz="4"/>
+              <w:left w:val="single" w:color="BFBFBF" w:sz="4"/>
+              <w:bottom w:val="single" w:color="BFBFBF" w:sz="4"/>
+              <w:right w:val="single" w:color="BFBFBF" w:sz="4"/>
+            </w:tcBorders>
+            <w:tcMar>
+              <w:top w:type="dxa" w:w="70"/>
+              <w:left w:type="dxa" w:w="100"/>
+              <w:bottom w:type="dxa" w:w="70"/>
+              <w:right w:type="dxa" w:w="100"/>
+            </w:tcMar>
+          </w:tcPr>
+          <w:p>
+            <w:pPr>
+              <w:spacing w:after="40"/>
+            </w:pPr>
+            <w:r>
+              <w:rPr>
+                <w:rFonts w:ascii="Calibri" w:cs="Calibri" w:eastAsia="Calibri" w:hAnsi="Calibri"/>
+                <w:b w:val="false"/>
+                <w:bCs w:val="false"/>
+                <w:color w:val="000000"/>
+                <w:sz w:val="19"/>
+                <w:szCs w:val="19"/>
+              </w:rPr>
+              <w:t xml:space="preserve">Referências</w:t>
+            </w:r>
+          </w:p>
+        </w:tc>
+        <w:tc>
+          <w:tcPr>
+            <w:tcW w:type="dxa" w:w="4000"/>
+            <w:tcBorders>
+              <w:top w:val="single" w:color="BFBFBF" w:sz="4"/>
+              <w:left w:val="single" w:color="BFBFBF" w:sz="4"/>
+              <w:bottom w:val="single" w:color="BFBFBF" w:sz="4"/>
+              <w:right w:val="single" w:color="BFBFBF" w:sz="4"/>
+            </w:tcBorders>
+            <w:tcMar>
+              <w:top w:type="dxa" w:w="70"/>
+              <w:left w:type="dxa" w:w="100"/>
+              <w:bottom w:type="dxa" w:w="70"/>
+              <w:right w:type="dxa" w:w="100"/>
+            </w:tcMar>
+          </w:tcPr>
+          <w:p>
+            <w:pPr>
+              <w:spacing w:after="40"/>
+            </w:pPr>
+            <w:r>
+              <w:rPr>
+                <w:rFonts w:ascii="Calibri" w:cs="Calibri" w:eastAsia="Calibri" w:hAnsi="Calibri"/>
+                <w:b w:val="false"/>
+                <w:bCs w:val="false"/>
+                <w:color w:val="000000"/>
+                <w:sz w:val="19"/>
+                <w:szCs w:val="19"/>
+              </w:rPr>
+              <w:t xml:space="preserve">Ordem alfabética quebrada após padronizar autores institucionais</w:t>
+            </w:r>
+          </w:p>
+        </w:tc>
+        <w:tc>
+          <w:tcPr>
+            <w:tcW w:type="dxa" w:w="2938"/>
+            <w:tcBorders>
+              <w:top w:val="single" w:color="BFBFBF" w:sz="4"/>
+              <w:left w:val="single" w:color="BFBFBF" w:sz="4"/>
+              <w:bottom w:val="single" w:color="BFBFBF" w:sz="4"/>
+              <w:right w:val="single" w:color="BFBFBF" w:sz="4"/>
+            </w:tcBorders>
+            <w:tcMar>
+              <w:top w:type="dxa" w:w="70"/>
+              <w:left w:type="dxa" w:w="100"/>
+              <w:bottom w:type="dxa" w:w="70"/>
+              <w:right w:type="dxa" w:w="100"/>
+            </w:tcMar>
+          </w:tcPr>
+          <w:p>
+            <w:pPr>
+              <w:spacing w:after="40"/>
+            </w:pPr>
+            <w:r>
+              <w:rPr>
+                <w:rFonts w:ascii="Calibri" w:cs="Calibri" w:eastAsia="Calibri" w:hAnsi="Calibri"/>
+                <w:b w:val="false"/>
+                <w:bCs w:val="false"/>
+                <w:color w:val="000000"/>
+                <w:sz w:val="19"/>
+                <w:szCs w:val="19"/>
+              </w:rPr>
+              <w:t xml:space="preserve">Reordenadas</w:t>
+            </w:r>
+          </w:p>
+        </w:tc>
+      </w:tr>
+      <w:tr>
+        <w:trPr>
+          <w:cantSplit/>
+        </w:trPr>
+        <w:tc>
+          <w:tcPr>
+            <w:tcW w:type="dxa" w:w="2700"/>
+            <w:tcBorders>
+              <w:top w:val="single" w:color="BFBFBF" w:sz="4"/>
+              <w:left w:val="single" w:color="BFBFBF" w:sz="4"/>
+              <w:bottom w:val="single" w:color="BFBFBF" w:sz="4"/>
+              <w:right w:val="single" w:color="BFBFBF" w:sz="4"/>
+            </w:tcBorders>
+            <w:tcMar>
+              <w:top w:type="dxa" w:w="70"/>
+              <w:left w:type="dxa" w:w="100"/>
+              <w:bottom w:type="dxa" w:w="70"/>
+              <w:right w:type="dxa" w:w="100"/>
+            </w:tcMar>
+          </w:tcPr>
+          <w:p>
+            <w:pPr>
+              <w:spacing w:after="40"/>
+            </w:pPr>
+            <w:r>
+              <w:rPr>
+                <w:rFonts w:ascii="Calibri" w:cs="Calibri" w:eastAsia="Calibri" w:hAnsi="Calibri"/>
+                <w:b w:val="false"/>
+                <w:bCs w:val="false"/>
+                <w:color w:val="000000"/>
+                <w:sz w:val="19"/>
+                <w:szCs w:val="19"/>
+              </w:rPr>
+              <w:t xml:space="preserve">Cabeçalho do Capítulo 4</w:t>
+            </w:r>
+          </w:p>
+        </w:tc>
+        <w:tc>
+          <w:tcPr>
+            <w:tcW w:type="dxa" w:w="4000"/>
+            <w:tcBorders>
+              <w:top w:val="single" w:color="BFBFBF" w:sz="4"/>
+              <w:left w:val="single" w:color="BFBFBF" w:sz="4"/>
+              <w:bottom w:val="single" w:color="BFBFBF" w:sz="4"/>
+              <w:right w:val="single" w:color="BFBFBF" w:sz="4"/>
+            </w:tcBorders>
+            <w:tcMar>
+              <w:top w:type="dxa" w:w="70"/>
+              <w:left w:type="dxa" w:w="100"/>
+              <w:bottom w:type="dxa" w:w="70"/>
+              <w:right w:type="dxa" w:w="100"/>
+            </w:tcMar>
+          </w:tcPr>
+          <w:p>
+            <w:pPr>
+              <w:spacing w:after="40"/>
+            </w:pPr>
+            <w:r>
+              <w:rPr>
+                <w:rFonts w:ascii="Calibri" w:cs="Calibri" w:eastAsia="Calibri" w:hAnsi="Calibri"/>
+                <w:b w:val="false"/>
+                <w:bCs w:val="false"/>
+                <w:color w:val="000000"/>
+                <w:sz w:val="19"/>
+                <w:szCs w:val="19"/>
+              </w:rPr>
+              <w:t xml:space="preserve">"GESTORES DE PROJETO", diferente do título do capítulo</w:t>
+            </w:r>
+          </w:p>
+        </w:tc>
+        <w:tc>
+          <w:tcPr>
+            <w:tcW w:type="dxa" w:w="2938"/>
+            <w:tcBorders>
+              <w:top w:val="single" w:color="BFBFBF" w:sz="4"/>
+              <w:left w:val="single" w:color="BFBFBF" w:sz="4"/>
+              <w:bottom w:val="single" w:color="BFBFBF" w:sz="4"/>
+              <w:right w:val="single" w:color="BFBFBF" w:sz="4"/>
+            </w:tcBorders>
+            <w:tcMar>
+              <w:top w:type="dxa" w:w="70"/>
+              <w:left w:type="dxa" w:w="100"/>
+              <w:bottom w:type="dxa" w:w="70"/>
+              <w:right w:type="dxa" w:w="100"/>
+            </w:tcMar>
+          </w:tcPr>
+          <w:p>
+            <w:pPr>
+              <w:spacing w:after="40"/>
+            </w:pPr>
+            <w:r>
+              <w:rPr>
+                <w:rFonts w:ascii="Calibri" w:cs="Calibri" w:eastAsia="Calibri" w:hAnsi="Calibri"/>
+                <w:b w:val="false"/>
+                <w:bCs w:val="false"/>
+                <w:color w:val="000000"/>
+                <w:sz w:val="19"/>
+                <w:szCs w:val="19"/>
+              </w:rPr>
+              <w:t xml:space="preserve">Corrigido para "PROJETOS"</w:t>
+            </w:r>
+          </w:p>
+        </w:tc>
+      </w:tr>
+      <w:tr>
+        <w:trPr>
+          <w:cantSplit/>
+        </w:trPr>
+        <w:tc>
+          <w:tcPr>
+            <w:tcW w:type="dxa" w:w="2700"/>
+            <w:tcBorders>
+              <w:top w:val="single" w:color="BFBFBF" w:sz="4"/>
+              <w:left w:val="single" w:color="BFBFBF" w:sz="4"/>
+              <w:bottom w:val="single" w:color="BFBFBF" w:sz="4"/>
+              <w:right w:val="single" w:color="BFBFBF" w:sz="4"/>
+            </w:tcBorders>
+            <w:tcMar>
+              <w:top w:type="dxa" w:w="70"/>
+              <w:left w:type="dxa" w:w="100"/>
+              <w:bottom w:type="dxa" w:w="70"/>
+              <w:right w:type="dxa" w:w="100"/>
+            </w:tcMar>
+          </w:tcPr>
+          <w:p>
+            <w:pPr>
+              <w:spacing w:after="40"/>
+            </w:pPr>
+            <w:r>
+              <w:rPr>
+                <w:rFonts w:ascii="Calibri" w:cs="Calibri" w:eastAsia="Calibri" w:hAnsi="Calibri"/>
+                <w:b w:val="false"/>
+                <w:bCs w:val="false"/>
+                <w:color w:val="000000"/>
+                <w:sz w:val="19"/>
+                <w:szCs w:val="19"/>
+              </w:rPr>
               <w:t xml:space="preserve">Afirmações absolutas</w:t>
             </w:r>
           </w:p>
@@ -4715,7 +5235,7 @@
           <w:sz w:val="22"/>
           <w:szCs w:val="22"/>
         </w:rPr>
-        <w:t xml:space="preserve">Pesquisei na web o que determina se a obra está atual. Quando a fonte primária não pôde ser aberta, registrei isso. A tabela mostra o que confirmei, o que alterei e o que fica para você conferir.</w:t>
+        <w:t xml:space="preserve">Pesquisei na web o que determina se a obra está atual. O acesso direto às páginas das fontes está bloqueado neste ambiente (os links não abrem), então a conferência se apoiou em resultados de busca, páginas e resumos indexados. Quando não consegui confirmar algo, registrei.</w:t>
       </w:r>
     </w:p>
     <w:tbl>
@@ -4908,7 +5428,7 @@
                 <w:sz w:val="19"/>
                 <w:szCs w:val="19"/>
               </w:rPr>
-              <w:t xml:space="preserve">Publicada em novembro de 2025; seis princípios, sete domínios de desempenho, cinco áreas de foco, cobertura ampliada de IA, PMOs e aquisições (página do PMI e fontes de treinamento). Confere com o Capítulo 2</w:t>
+              <w:t xml:space="preserve">Publicada em novembro de 2025; seis princípios, sete domínios de desempenho, cinco áreas de foco, cobertura ampliada de IA, PMOs e aquisições. Confere com o Capítulo 2</w:t>
             </w:r>
           </w:p>
         </w:tc>
@@ -4941,7 +5461,7 @@
                 <w:sz w:val="19"/>
                 <w:szCs w:val="19"/>
               </w:rPr>
-              <w:t xml:space="preserve">Removi apenas o "inicialmente". Sem outras mudanças</w:t>
+              <w:t xml:space="preserve">Removi apenas o "inicialmente"</w:t>
             </w:r>
           </w:p>
         </w:tc>
@@ -5045,7 +5565,7 @@
                 <w:sz w:val="19"/>
                 <w:szCs w:val="19"/>
               </w:rPr>
-              <w:t xml:space="preserve">Inseri frase no Capítulo 7 dizendo que o cronograma foi alterado e que os prazos devem ser conferidos no Jornal Oficial. Confira o ato final antes de imprimir</w:t>
+              <w:t xml:space="preserve">Frase inserida no Capítulo 7 dizendo que o cronograma foi alterado e que os prazos devem ser conferidos no Jornal Oficial</w:t>
             </w:r>
           </w:p>
         </w:tc>
@@ -5083,7 +5603,7 @@
                 <w:sz w:val="19"/>
                 <w:szCs w:val="19"/>
               </w:rPr>
-              <w:t xml:space="preserve">PL 2338/2023 (marco da IA no Brasil)</w:t>
+              <w:t xml:space="preserve">PL 2338/2023</w:t>
             </w:r>
           </w:p>
         </w:tc>
@@ -5149,7 +5669,7 @@
                 <w:sz w:val="19"/>
                 <w:szCs w:val="19"/>
               </w:rPr>
-              <w:t xml:space="preserve">O texto do livro continua correto; acrescentei a informação do Senado e da Câmara. Reconfira na ficha de tramitação perto da impressão</w:t>
+              <w:t xml:space="preserve">Texto continua correto; acrescentei a informação do Senado e da Câmara</w:t>
             </w:r>
           </w:p>
         </w:tc>
@@ -5324,7 +5844,7 @@
                 <w:sz w:val="19"/>
                 <w:szCs w:val="19"/>
               </w:rPr>
-              <w:t xml:space="preserve">A Microsoft reuniu o AutoGen e o Semantic Kernel no Microsoft Agent Framework (informação do meu conhecimento, não reconfirmada nesta sessão)</w:t>
+              <w:t xml:space="preserve">A Microsoft reuniu o AutoGen e o Semantic Kernel no Microsoft Agent Framework (do meu conhecimento; a busca desta sessão não tratou do tema)</w:t>
             </w:r>
           </w:p>
         </w:tc>
@@ -5532,7 +6052,7 @@
                 <w:sz w:val="19"/>
                 <w:szCs w:val="19"/>
               </w:rPr>
-              <w:t xml:space="preserve">Megaprojetos acima de US$ 1 bilhão: custo pelo menos 79% acima e prazo 52% acima, confirmado. O percentual de 83% dos projetos com problemas não foi encontrado; o resumo da pesquisa indica cerca de 40% de estouro e cerca de 25% de atraso</w:t>
+              <w:t xml:space="preserve">Resumo da própria McKinsey: desafios de custo e prazo em 83% dos grandes projetos recentes, estouro de CAPEX acima de 40% e atrasos de 20 a 30%; megaprojetos acima de US$ 1 bilhão com custo pelo menos 79% e prazo 52% acima</w:t>
             </w:r>
           </w:p>
         </w:tc>
@@ -5565,7 +6085,7 @@
                 <w:sz w:val="19"/>
                 <w:szCs w:val="19"/>
               </w:rPr>
-              <w:t xml:space="preserve">Troquei "83%" por "a maioria" e "acima de 40%" por "cerca de 40%". Confira o relatório original e, se tiver o 83%, restabeleça com a definição exata</w:t>
+              <w:t xml:space="preserve">Confirmado. Na primeira rodada eu havia suavizado o "83%" por não achá-lo; revertido, o texto original está correto</w:t>
             </w:r>
           </w:p>
         </w:tc>
@@ -5603,7 +6123,7 @@
                 <w:sz w:val="19"/>
                 <w:szCs w:val="19"/>
               </w:rPr>
-              <w:t xml:space="preserve">PDRI (CII)</w:t>
+              <w:t xml:space="preserve">McKinsey (2025a)</w:t>
             </w:r>
           </w:p>
         </w:tc>
@@ -5636,7 +6156,7 @@
                 <w:sz w:val="19"/>
                 <w:szCs w:val="19"/>
               </w:rPr>
-              <w:t xml:space="preserve">O limite de 200 pontos confere. A fonte consultada indica a publicação IR 113-2 de 1996; o livro cita "versão 5.0, 2019"</w:t>
+              <w:t xml:space="preserve">Mais de 300 megaprojetos acima de US$ 1 bilhão, com estouro médio de cerca de 80% e atraso de cerca de 50%</w:t>
             </w:r>
           </w:p>
         </w:tc>
@@ -5669,7 +6189,7 @@
                 <w:sz w:val="19"/>
                 <w:szCs w:val="19"/>
               </w:rPr>
-              <w:t xml:space="preserve">Não alterei. Confirme edição e ano na página do CII</w:t>
+              <w:t xml:space="preserve">Confirmado; apenas troquei "~" por "cerca de"</w:t>
             </w:r>
           </w:p>
         </w:tc>
@@ -5707,7 +6227,7 @@
                 <w:sz w:val="19"/>
                 <w:szCs w:val="19"/>
               </w:rPr>
-              <w:t xml:space="preserve">Origem do FEL</w:t>
+              <w:t xml:space="preserve">PMI (2023)</w:t>
             </w:r>
           </w:p>
         </w:tc>
@@ -5740,7 +6260,7 @@
                 <w:sz w:val="19"/>
                 <w:szCs w:val="19"/>
               </w:rPr>
-              <w:t xml:space="preserve">Não consegui confirmar DuPont nos anos 1970 e padronização pelo IPA nos anos 1990</w:t>
+              <w:t xml:space="preserve">Página do PMI traz 91% (impacto na profissão) e 82% dos líderes seniores (impacto nos projetos). A expressão "ao menos moderado" aparece só em fonte secundária</w:t>
             </w:r>
           </w:p>
         </w:tc>
@@ -5773,7 +6293,7 @@
                 <w:sz w:val="19"/>
                 <w:szCs w:val="19"/>
               </w:rPr>
-              <w:t xml:space="preserve">Mantive e fluidifiquei a frase. Recomendo uma fonte primária ou suavizar</w:t>
+              <w:t xml:space="preserve">Números confirmados. Se quiser rigor, troque "ao menos moderado" por "algum impacto" ou confira o relatório</w:t>
             </w:r>
           </w:p>
         </w:tc>
@@ -5811,7 +6331,7 @@
                 <w:sz w:val="19"/>
                 <w:szCs w:val="19"/>
               </w:rPr>
-              <w:t xml:space="preserve">Flyvbjerg et al. (2003)</w:t>
+              <w:t xml:space="preserve">PDRI (CII)</w:t>
             </w:r>
           </w:p>
         </w:tc>
@@ -5844,7 +6364,7 @@
                 <w:sz w:val="19"/>
                 <w:szCs w:val="19"/>
               </w:rPr>
-              <w:t xml:space="preserve">O estudo é conhecido pela explicação político-econômica (deturpação estratégica), além da psicológica</w:t>
+              <w:t xml:space="preserve">O limite de 200 pontos confere. Não localizei a edição "5.0, 2019"; a referência da obra aponta a publicação IR 113-2, e uma fonte consultada a data de 1996</w:t>
             </w:r>
           </w:p>
         </w:tc>
@@ -5877,7 +6397,7 @@
                 <w:sz w:val="19"/>
                 <w:szCs w:val="19"/>
               </w:rPr>
-              <w:t xml:space="preserve">Reescrevi para citar as duas famílias de explicação. Confirme se a "planning fallacy" é de fato atribuída a esse artigo</w:t>
+              <w:t xml:space="preserve">Não alterei. Confirme edição e ano na loja de publicações do CII</w:t>
             </w:r>
           </w:p>
         </w:tc>
@@ -5915,7 +6435,7 @@
                 <w:sz w:val="19"/>
                 <w:szCs w:val="19"/>
               </w:rPr>
-              <w:t xml:space="preserve">Outros números</w:t>
+              <w:t xml:space="preserve">Origem do FEL</w:t>
             </w:r>
           </w:p>
         </w:tc>
@@ -5948,7 +6468,7 @@
                 <w:sz w:val="19"/>
                 <w:szCs w:val="19"/>
               </w:rPr>
-              <w:t xml:space="preserve">McKinsey (2017) com 15 a 25%, 10% e 45%; McKinsey (2025a) com cerca de 80% e 50%; PMI Sweden com 76%; PMI (2023) com 91% e 82%; Menlo com cerca de 500 decisores</w:t>
+              <w:t xml:space="preserve">Não encontrei fonte que ligue o termo à DuPont. Fontes indicam uso desde pelo menos os anos 1980 e a IPA fundada em 1987, que padronizou os índices de FEL</w:t>
             </w:r>
           </w:p>
         </w:tc>
@@ -5981,7 +6501,7 @@
                 <w:sz w:val="19"/>
                 <w:szCs w:val="19"/>
               </w:rPr>
-              <w:t xml:space="preserve">Não verificados (acesso direto às fontes bloqueado). Substituí "~" por "cerca de" onde cabia. Confira antes de publicar</w:t>
+              <w:t xml:space="preserve">Retirei a atribuição à DuPont e à década de 1970; a frase agora é conservadora. Se tiver fonte para a DuPont, restabeleça com a citação</w:t>
             </w:r>
           </w:p>
         </w:tc>
@@ -6019,6 +6539,422 @@
                 <w:sz w:val="19"/>
                 <w:szCs w:val="19"/>
               </w:rPr>
+              <w:t xml:space="preserve">Flyvbjerg et al. (2003)</w:t>
+            </w:r>
+          </w:p>
+        </w:tc>
+        <w:tc>
+          <w:tcPr>
+            <w:tcW w:type="dxa" w:w="4300"/>
+            <w:tcBorders>
+              <w:top w:val="single" w:color="BFBFBF" w:sz="4"/>
+              <w:left w:val="single" w:color="BFBFBF" w:sz="4"/>
+              <w:bottom w:val="single" w:color="BFBFBF" w:sz="4"/>
+              <w:right w:val="single" w:color="BFBFBF" w:sz="4"/>
+            </w:tcBorders>
+            <w:tcMar>
+              <w:top w:type="dxa" w:w="70"/>
+              <w:left w:type="dxa" w:w="100"/>
+              <w:bottom w:type="dxa" w:w="70"/>
+              <w:right w:type="dxa" w:w="100"/>
+            </w:tcMar>
+          </w:tcPr>
+          <w:p>
+            <w:pPr>
+              <w:spacing w:after="40"/>
+            </w:pPr>
+            <w:r>
+              <w:rPr>
+                <w:rFonts w:ascii="Calibri" w:cs="Calibri" w:eastAsia="Calibri" w:hAnsi="Calibri"/>
+                <w:b w:val="false"/>
+                <w:bCs w:val="false"/>
+                <w:color w:val="000000"/>
+                <w:sz w:val="19"/>
+                <w:szCs w:val="19"/>
+              </w:rPr>
+              <w:t xml:space="preserve">O artigo de 2003 trata da estatística (258 projetos, 20 países, cerca de US$ 90 bilhões, grande maioria com estouro). As explicações psicológicas e a deturpação estratégica vêm de trabalhos correlatos do grupo</w:t>
+            </w:r>
+          </w:p>
+        </w:tc>
+        <w:tc>
+          <w:tcPr>
+            <w:tcW w:type="dxa" w:w="3138"/>
+            <w:tcBorders>
+              <w:top w:val="single" w:color="BFBFBF" w:sz="4"/>
+              <w:left w:val="single" w:color="BFBFBF" w:sz="4"/>
+              <w:bottom w:val="single" w:color="BFBFBF" w:sz="4"/>
+              <w:right w:val="single" w:color="BFBFBF" w:sz="4"/>
+            </w:tcBorders>
+            <w:tcMar>
+              <w:top w:type="dxa" w:w="70"/>
+              <w:left w:type="dxa" w:w="100"/>
+              <w:bottom w:type="dxa" w:w="70"/>
+              <w:right w:type="dxa" w:w="100"/>
+            </w:tcMar>
+          </w:tcPr>
+          <w:p>
+            <w:pPr>
+              <w:spacing w:after="40"/>
+            </w:pPr>
+            <w:r>
+              <w:rPr>
+                <w:rFonts w:ascii="Calibri" w:cs="Calibri" w:eastAsia="Calibri" w:hAnsi="Calibri"/>
+                <w:b w:val="false"/>
+                <w:bCs w:val="false"/>
+                <w:color w:val="000000"/>
+                <w:sz w:val="19"/>
+                <w:szCs w:val="19"/>
+              </w:rPr>
+              <w:t xml:space="preserve">Reescrevi para separar os dois pontos. Se quiser citar os trabalhos das explicações, acrescente a referência</w:t>
+            </w:r>
+          </w:p>
+        </w:tc>
+      </w:tr>
+      <w:tr>
+        <w:trPr>
+          <w:cantSplit/>
+        </w:trPr>
+        <w:tc>
+          <w:tcPr>
+            <w:tcW w:type="dxa" w:w="2200"/>
+            <w:tcBorders>
+              <w:top w:val="single" w:color="BFBFBF" w:sz="4"/>
+              <w:left w:val="single" w:color="BFBFBF" w:sz="4"/>
+              <w:bottom w:val="single" w:color="BFBFBF" w:sz="4"/>
+              <w:right w:val="single" w:color="BFBFBF" w:sz="4"/>
+            </w:tcBorders>
+            <w:tcMar>
+              <w:top w:type="dxa" w:w="70"/>
+              <w:left w:type="dxa" w:w="100"/>
+              <w:bottom w:type="dxa" w:w="70"/>
+              <w:right w:type="dxa" w:w="100"/>
+            </w:tcMar>
+          </w:tcPr>
+          <w:p>
+            <w:pPr>
+              <w:spacing w:after="40"/>
+            </w:pPr>
+            <w:r>
+              <w:rPr>
+                <w:rFonts w:ascii="Calibri" w:cs="Calibri" w:eastAsia="Calibri" w:hAnsi="Calibri"/>
+                <w:b w:val="false"/>
+                <w:bCs w:val="false"/>
+                <w:color w:val="000000"/>
+                <w:sz w:val="19"/>
+                <w:szCs w:val="19"/>
+              </w:rPr>
+              <w:t xml:space="preserve">McKinsey (2017)</w:t>
+            </w:r>
+          </w:p>
+        </w:tc>
+        <w:tc>
+          <w:tcPr>
+            <w:tcW w:type="dxa" w:w="4300"/>
+            <w:tcBorders>
+              <w:top w:val="single" w:color="BFBFBF" w:sz="4"/>
+              <w:left w:val="single" w:color="BFBFBF" w:sz="4"/>
+              <w:bottom w:val="single" w:color="BFBFBF" w:sz="4"/>
+              <w:right w:val="single" w:color="BFBFBF" w:sz="4"/>
+            </w:tcBorders>
+            <w:tcMar>
+              <w:top w:type="dxa" w:w="70"/>
+              <w:left w:type="dxa" w:w="100"/>
+              <w:bottom w:type="dxa" w:w="70"/>
+              <w:right w:type="dxa" w:w="100"/>
+            </w:tcMar>
+          </w:tcPr>
+          <w:p>
+            <w:pPr>
+              <w:spacing w:after="40"/>
+            </w:pPr>
+            <w:r>
+              <w:rPr>
+                <w:rFonts w:ascii="Calibri" w:cs="Calibri" w:eastAsia="Calibri" w:hAnsi="Calibri"/>
+                <w:b w:val="false"/>
+                <w:bCs w:val="false"/>
+                <w:color w:val="000000"/>
+                <w:sz w:val="19"/>
+                <w:szCs w:val="19"/>
+              </w:rPr>
+              <w:t xml:space="preserve">Encontrei 15 a 25% de produtividade em página da McKinsey sobre sua plataforma de analytics e 20 a 45% de redução de custos em apresentação de 2018, mas não nos trechos do artigo de 2017 citado</w:t>
+            </w:r>
+          </w:p>
+        </w:tc>
+        <w:tc>
+          <w:tcPr>
+            <w:tcW w:type="dxa" w:w="3138"/>
+            <w:tcBorders>
+              <w:top w:val="single" w:color="BFBFBF" w:sz="4"/>
+              <w:left w:val="single" w:color="BFBFBF" w:sz="4"/>
+              <w:bottom w:val="single" w:color="BFBFBF" w:sz="4"/>
+              <w:right w:val="single" w:color="BFBFBF" w:sz="4"/>
+            </w:tcBorders>
+            <w:tcMar>
+              <w:top w:type="dxa" w:w="70"/>
+              <w:left w:type="dxa" w:w="100"/>
+              <w:bottom w:type="dxa" w:w="70"/>
+              <w:right w:type="dxa" w:w="100"/>
+            </w:tcMar>
+          </w:tcPr>
+          <w:p>
+            <w:pPr>
+              <w:spacing w:after="40"/>
+            </w:pPr>
+            <w:r>
+              <w:rPr>
+                <w:rFonts w:ascii="Calibri" w:cs="Calibri" w:eastAsia="Calibri" w:hAnsi="Calibri"/>
+                <w:b w:val="false"/>
+                <w:bCs w:val="false"/>
+                <w:color w:val="000000"/>
+                <w:sz w:val="19"/>
+                <w:szCs w:val="19"/>
+              </w:rPr>
+              <w:t xml:space="preserve">Não alterei. Confira o artigo original antes de manter as três porcentagens</w:t>
+            </w:r>
+          </w:p>
+        </w:tc>
+      </w:tr>
+      <w:tr>
+        <w:trPr>
+          <w:cantSplit/>
+        </w:trPr>
+        <w:tc>
+          <w:tcPr>
+            <w:tcW w:type="dxa" w:w="2200"/>
+            <w:tcBorders>
+              <w:top w:val="single" w:color="BFBFBF" w:sz="4"/>
+              <w:left w:val="single" w:color="BFBFBF" w:sz="4"/>
+              <w:bottom w:val="single" w:color="BFBFBF" w:sz="4"/>
+              <w:right w:val="single" w:color="BFBFBF" w:sz="4"/>
+            </w:tcBorders>
+            <w:tcMar>
+              <w:top w:type="dxa" w:w="70"/>
+              <w:left w:type="dxa" w:w="100"/>
+              <w:bottom w:type="dxa" w:w="70"/>
+              <w:right w:type="dxa" w:w="100"/>
+            </w:tcMar>
+          </w:tcPr>
+          <w:p>
+            <w:pPr>
+              <w:spacing w:after="40"/>
+            </w:pPr>
+            <w:r>
+              <w:rPr>
+                <w:rFonts w:ascii="Calibri" w:cs="Calibri" w:eastAsia="Calibri" w:hAnsi="Calibri"/>
+                <w:b w:val="false"/>
+                <w:bCs w:val="false"/>
+                <w:color w:val="000000"/>
+                <w:sz w:val="19"/>
+                <w:szCs w:val="19"/>
+              </w:rPr>
+              <w:t xml:space="preserve">PMI Sweden (2024)</w:t>
+            </w:r>
+          </w:p>
+        </w:tc>
+        <w:tc>
+          <w:tcPr>
+            <w:tcW w:type="dxa" w:w="4300"/>
+            <w:tcBorders>
+              <w:top w:val="single" w:color="BFBFBF" w:sz="4"/>
+              <w:left w:val="single" w:color="BFBFBF" w:sz="4"/>
+              <w:bottom w:val="single" w:color="BFBFBF" w:sz="4"/>
+              <w:right w:val="single" w:color="BFBFBF" w:sz="4"/>
+            </w:tcBorders>
+            <w:tcMar>
+              <w:top w:type="dxa" w:w="70"/>
+              <w:left w:type="dxa" w:w="100"/>
+              <w:bottom w:type="dxa" w:w="70"/>
+              <w:right w:type="dxa" w:w="100"/>
+            </w:tcMar>
+          </w:tcPr>
+          <w:p>
+            <w:pPr>
+              <w:spacing w:after="40"/>
+            </w:pPr>
+            <w:r>
+              <w:rPr>
+                <w:rFonts w:ascii="Calibri" w:cs="Calibri" w:eastAsia="Calibri" w:hAnsi="Calibri"/>
+                <w:b w:val="false"/>
+                <w:bCs w:val="false"/>
+                <w:color w:val="000000"/>
+                <w:sz w:val="19"/>
+                <w:szCs w:val="19"/>
+              </w:rPr>
+              <w:t xml:space="preserve">A pesquisa existe (mais de 2.300 respondentes de 129 países). O percentual de 76% não apareceu</w:t>
+            </w:r>
+          </w:p>
+        </w:tc>
+        <w:tc>
+          <w:tcPr>
+            <w:tcW w:type="dxa" w:w="3138"/>
+            <w:tcBorders>
+              <w:top w:val="single" w:color="BFBFBF" w:sz="4"/>
+              <w:left w:val="single" w:color="BFBFBF" w:sz="4"/>
+              <w:bottom w:val="single" w:color="BFBFBF" w:sz="4"/>
+              <w:right w:val="single" w:color="BFBFBF" w:sz="4"/>
+            </w:tcBorders>
+            <w:tcMar>
+              <w:top w:type="dxa" w:w="70"/>
+              <w:left w:type="dxa" w:w="100"/>
+              <w:bottom w:type="dxa" w:w="70"/>
+              <w:right w:type="dxa" w:w="100"/>
+            </w:tcMar>
+          </w:tcPr>
+          <w:p>
+            <w:pPr>
+              <w:spacing w:after="40"/>
+            </w:pPr>
+            <w:r>
+              <w:rPr>
+                <w:rFonts w:ascii="Calibri" w:cs="Calibri" w:eastAsia="Calibri" w:hAnsi="Calibri"/>
+                <w:b w:val="false"/>
+                <w:bCs w:val="false"/>
+                <w:color w:val="000000"/>
+                <w:sz w:val="19"/>
+                <w:szCs w:val="19"/>
+              </w:rPr>
+              <w:t xml:space="preserve">Não alterei. Confira no relatório</w:t>
+            </w:r>
+          </w:p>
+        </w:tc>
+      </w:tr>
+      <w:tr>
+        <w:trPr>
+          <w:cantSplit/>
+        </w:trPr>
+        <w:tc>
+          <w:tcPr>
+            <w:tcW w:type="dxa" w:w="2200"/>
+            <w:tcBorders>
+              <w:top w:val="single" w:color="BFBFBF" w:sz="4"/>
+              <w:left w:val="single" w:color="BFBFBF" w:sz="4"/>
+              <w:bottom w:val="single" w:color="BFBFBF" w:sz="4"/>
+              <w:right w:val="single" w:color="BFBFBF" w:sz="4"/>
+            </w:tcBorders>
+            <w:tcMar>
+              <w:top w:type="dxa" w:w="70"/>
+              <w:left w:type="dxa" w:w="100"/>
+              <w:bottom w:type="dxa" w:w="70"/>
+              <w:right w:type="dxa" w:w="100"/>
+            </w:tcMar>
+          </w:tcPr>
+          <w:p>
+            <w:pPr>
+              <w:spacing w:after="40"/>
+            </w:pPr>
+            <w:r>
+              <w:rPr>
+                <w:rFonts w:ascii="Calibri" w:cs="Calibri" w:eastAsia="Calibri" w:hAnsi="Calibri"/>
+                <w:b w:val="false"/>
+                <w:bCs w:val="false"/>
+                <w:color w:val="000000"/>
+                <w:sz w:val="19"/>
+                <w:szCs w:val="19"/>
+              </w:rPr>
+              <w:t xml:space="preserve">Menlo Ventures (2025)</w:t>
+            </w:r>
+          </w:p>
+        </w:tc>
+        <w:tc>
+          <w:tcPr>
+            <w:tcW w:type="dxa" w:w="4300"/>
+            <w:tcBorders>
+              <w:top w:val="single" w:color="BFBFBF" w:sz="4"/>
+              <w:left w:val="single" w:color="BFBFBF" w:sz="4"/>
+              <w:bottom w:val="single" w:color="BFBFBF" w:sz="4"/>
+              <w:right w:val="single" w:color="BFBFBF" w:sz="4"/>
+            </w:tcBorders>
+            <w:tcMar>
+              <w:top w:type="dxa" w:w="70"/>
+              <w:left w:type="dxa" w:w="100"/>
+              <w:bottom w:type="dxa" w:w="70"/>
+              <w:right w:type="dxa" w:w="100"/>
+            </w:tcMar>
+          </w:tcPr>
+          <w:p>
+            <w:pPr>
+              <w:spacing w:after="40"/>
+            </w:pPr>
+            <w:r>
+              <w:rPr>
+                <w:rFonts w:ascii="Calibri" w:cs="Calibri" w:eastAsia="Calibri" w:hAnsi="Calibri"/>
+                <w:b w:val="false"/>
+                <w:bCs w:val="false"/>
+                <w:color w:val="000000"/>
+                <w:sz w:val="19"/>
+                <w:szCs w:val="19"/>
+              </w:rPr>
+              <w:t xml:space="preserve">O relatório existe (dezembro de 2025). A amostra de cerca de 500 decisores e o achado multi-modelo não foram confirmados</w:t>
+            </w:r>
+          </w:p>
+        </w:tc>
+        <w:tc>
+          <w:tcPr>
+            <w:tcW w:type="dxa" w:w="3138"/>
+            <w:tcBorders>
+              <w:top w:val="single" w:color="BFBFBF" w:sz="4"/>
+              <w:left w:val="single" w:color="BFBFBF" w:sz="4"/>
+              <w:bottom w:val="single" w:color="BFBFBF" w:sz="4"/>
+              <w:right w:val="single" w:color="BFBFBF" w:sz="4"/>
+            </w:tcBorders>
+            <w:tcMar>
+              <w:top w:type="dxa" w:w="70"/>
+              <w:left w:type="dxa" w:w="100"/>
+              <w:bottom w:type="dxa" w:w="70"/>
+              <w:right w:type="dxa" w:w="100"/>
+            </w:tcMar>
+          </w:tcPr>
+          <w:p>
+            <w:pPr>
+              <w:spacing w:after="40"/>
+            </w:pPr>
+            <w:r>
+              <w:rPr>
+                <w:rFonts w:ascii="Calibri" w:cs="Calibri" w:eastAsia="Calibri" w:hAnsi="Calibri"/>
+                <w:b w:val="false"/>
+                <w:bCs w:val="false"/>
+                <w:color w:val="000000"/>
+                <w:sz w:val="19"/>
+                <w:szCs w:val="19"/>
+              </w:rPr>
+              <w:t xml:space="preserve">Não alterei. Confira no relatório</w:t>
+            </w:r>
+          </w:p>
+        </w:tc>
+      </w:tr>
+      <w:tr>
+        <w:trPr>
+          <w:cantSplit/>
+        </w:trPr>
+        <w:tc>
+          <w:tcPr>
+            <w:tcW w:type="dxa" w:w="2200"/>
+            <w:tcBorders>
+              <w:top w:val="single" w:color="BFBFBF" w:sz="4"/>
+              <w:left w:val="single" w:color="BFBFBF" w:sz="4"/>
+              <w:bottom w:val="single" w:color="BFBFBF" w:sz="4"/>
+              <w:right w:val="single" w:color="BFBFBF" w:sz="4"/>
+            </w:tcBorders>
+            <w:tcMar>
+              <w:top w:type="dxa" w:w="70"/>
+              <w:left w:type="dxa" w:w="100"/>
+              <w:bottom w:type="dxa" w:w="70"/>
+              <w:right w:type="dxa" w:w="100"/>
+            </w:tcMar>
+          </w:tcPr>
+          <w:p>
+            <w:pPr>
+              <w:spacing w:after="40"/>
+            </w:pPr>
+            <w:r>
+              <w:rPr>
+                <w:rFonts w:ascii="Calibri" w:cs="Calibri" w:eastAsia="Calibri" w:hAnsi="Calibri"/>
+                <w:b w:val="false"/>
+                <w:bCs w:val="false"/>
+                <w:color w:val="000000"/>
+                <w:sz w:val="19"/>
+                <w:szCs w:val="19"/>
+              </w:rPr>
               <w:t xml:space="preserve">Datas de acesso</w:t>
             </w:r>
           </w:p>
@@ -6052,7 +6988,7 @@
                 <w:sz w:val="19"/>
                 <w:szCs w:val="19"/>
               </w:rPr>
-              <w:t xml:space="preserve">As referências trazem "Acesso em" de junho e julho de 2026</w:t>
+              <w:t xml:space="preserve">As referências trazem "Acesso em" de junho e julho de 2026. Como não consigo abrir os links, não posso atestar um novo acesso</w:t>
             </w:r>
           </w:p>
         </w:tc>
@@ -6085,7 +7021,7 @@
                 <w:sz w:val="19"/>
                 <w:szCs w:val="19"/>
               </w:rPr>
-              <w:t xml:space="preserve">Atualize a data de acesso depois da conferência final</w:t>
+              <w:t xml:space="preserve">Mantidas. Atualize quando você mesmo conferir cada link</w:t>
             </w:r>
           </w:p>
         </w:tc>
@@ -6105,22 +7041,7 @@
           <w:sz w:val="25"/>
           <w:szCs w:val="25"/>
         </w:rPr>
-        <w:t xml:space="preserve">Pendências que dependem de você</w:t>
-      </w:r>
-    </w:p>
-    <w:p>
-      <w:pPr>
-        <w:spacing w:after="120" w:line="276"/>
-      </w:pPr>
-      <w:r>
-        <w:rPr>
-          <w:rFonts w:ascii="Calibri" w:cs="Calibri" w:eastAsia="Calibri" w:hAnsi="Calibri"/>
-          <w:b/>
-          <w:bCs/>
-          <w:sz w:val="22"/>
-          <w:szCs w:val="22"/>
-        </w:rPr>
-        <w:t xml:space="preserve">Bloqueantes para publicar</w:t>
+        <w:t xml:space="preserve">O que resolvi nesta segunda rodada</w:t>
       </w:r>
     </w:p>
     <w:p>
@@ -6138,7 +7059,7 @@
           <w:sz w:val="22"/>
           <w:szCs w:val="22"/>
         </w:rPr>
-        <w:t xml:space="preserve">Dados editoriais ainda com marcador: ISBN e ficha catalográfica (CIP).</w:t>
+        <w:t xml:space="preserve">Figuras: 5.2 (VPL e TIR), 1.1 (Classe 3) e 5.3 (recriada por inteiro, com o bloco do "Prompt de Controle Diário" que o texto citava).</w:t>
       </w:r>
     </w:p>
     <w:p>
@@ -6153,20 +7074,10 @@
       <w:r>
         <w:rPr>
           <w:rFonts w:ascii="Calibri" w:cs="Calibri" w:eastAsia="Calibri" w:hAnsi="Calibri"/>
-          <w:b/>
-          <w:bCs/>
-          <w:sz w:val="22"/>
-          <w:szCs w:val="22"/>
-        </w:rPr>
-        <w:t xml:space="preserve">Figura 5.3 (painel de controle). </w:t>
-      </w:r>
-      <w:r>
-        <w:rPr>
-          <w:rFonts w:ascii="Calibri" w:cs="Calibri" w:eastAsia="Calibri" w:hAnsi="Calibri"/>
-          <w:sz w:val="22"/>
-          <w:szCs w:val="22"/>
-        </w:rPr>
-        <w:t xml:space="preserve">A imagem contém marcadores não preenchidos ("[ANO]" e "[Código de cor Amarelo]"), erros de português nas ações do gerente ("Cousa provensda", "Rottattividades de equipe"), "Pacote D" duplicado, "Prob. 32%" repetido e um hífen no título. Recomendo refazê-la; os valores que o texto agora cita estão na seção 5.</w:t>
+          <w:sz w:val="22"/>
+          <w:szCs w:val="22"/>
+        </w:rPr>
+        <w:t xml:space="preserve">Textos: nota sobre exemplos independentes, cautela sobre cálculos de LLM, instrução de mostrar fórmulas nos prompts do Capítulo 5 e nota geral sobre as saídas de LLM.</w:t>
       </w:r>
     </w:p>
     <w:p>
@@ -6181,20 +7092,10 @@
       <w:r>
         <w:rPr>
           <w:rFonts w:ascii="Calibri" w:cs="Calibri" w:eastAsia="Calibri" w:hAnsi="Calibri"/>
-          <w:b/>
-          <w:bCs/>
-          <w:sz w:val="22"/>
-          <w:szCs w:val="22"/>
-        </w:rPr>
-        <w:t xml:space="preserve">Figura 1.1. </w:t>
-      </w:r>
-      <w:r>
-        <w:rPr>
-          <w:rFonts w:ascii="Calibri" w:cs="Calibri" w:eastAsia="Calibri" w:hAnsi="Calibri"/>
-          <w:sz w:val="22"/>
-          <w:szCs w:val="22"/>
-        </w:rPr>
-        <w:t xml:space="preserve">A Fase 3 mostra "Estimativas Classe 2", enquanto a Tabela 1.3 e o texto tratam a Classe 3 como padrão do FEL 3, com possível evolução para a Classe 2. Alinhe uma das duas.</w:t>
+          <w:sz w:val="22"/>
+          <w:szCs w:val="22"/>
+        </w:rPr>
+        <w:t xml:space="preserve">Sumário: o arquivo foi marcado para o Word atualizar os campos ao abrir. Quando o Word perguntar se deseja atualizar, responda Sim. Os números de página do sumário se corrigem nesse momento.</w:t>
       </w:r>
     </w:p>
     <w:p>
@@ -6209,20 +7110,27 @@
       <w:r>
         <w:rPr>
           <w:rFonts w:ascii="Calibri" w:cs="Calibri" w:eastAsia="Calibri" w:hAnsi="Calibri"/>
+          <w:sz w:val="22"/>
+          <w:szCs w:val="22"/>
+        </w:rPr>
+        <w:t xml:space="preserve">Fatos: conferi o que foi possível (tabela acima) e corrigi o que eu mesmo havia alterado em excesso (McKinsey) ou sem fonte (FEL e DuPont).</w:t>
+      </w:r>
+    </w:p>
+    <w:p>
+      <w:pPr>
+        <w:pStyle w:val="Heading2"/>
+        <w:spacing w:after="100" w:before="220"/>
+      </w:pPr>
+      <w:r>
+        <w:rPr>
+          <w:rFonts w:ascii="Calibri" w:cs="Calibri" w:eastAsia="Calibri" w:hAnsi="Calibri"/>
           <w:b/>
           <w:bCs/>
-          <w:sz w:val="22"/>
-          <w:szCs w:val="22"/>
-        </w:rPr>
-        <w:t xml:space="preserve">Sumário. </w:t>
-      </w:r>
-      <w:r>
-        <w:rPr>
-          <w:rFonts w:ascii="Calibri" w:cs="Calibri" w:eastAsia="Calibri" w:hAnsi="Calibri"/>
-          <w:sz w:val="22"/>
-          <w:szCs w:val="22"/>
-        </w:rPr>
-        <w:t xml:space="preserve">Os números de página do sumário são os da versão anterior. No Word, selecione tudo e pressione F9 (atualizar campos), e escolha "Atualizar o índice inteiro".</w:t>
+          <w:color w:val="2F5496"/>
+          <w:sz w:val="25"/>
+          <w:szCs w:val="25"/>
+        </w:rPr>
+        <w:t xml:space="preserve">Pendências que continuam dependendo de você</w:t>
       </w:r>
     </w:p>
     <w:p>
@@ -6237,25 +7145,20 @@
       <w:r>
         <w:rPr>
           <w:rFonts w:ascii="Calibri" w:cs="Calibri" w:eastAsia="Calibri" w:hAnsi="Calibri"/>
-          <w:sz w:val="22"/>
-          <w:szCs w:val="22"/>
-        </w:rPr>
-        <w:t xml:space="preserve">Conferência dos fatos listados na tabela acima.</w:t>
-      </w:r>
-    </w:p>
-    <w:p>
-      <w:pPr>
-        <w:spacing w:after="120" w:line="276"/>
-      </w:pPr>
-      <w:r>
-        <w:rPr>
-          <w:rFonts w:ascii="Calibri" w:cs="Calibri" w:eastAsia="Calibri" w:hAnsi="Calibri"/>
           <w:b/>
           <w:bCs/>
           <w:sz w:val="22"/>
           <w:szCs w:val="22"/>
         </w:rPr>
-        <w:t xml:space="preserve">Recomendadas</w:t>
+        <w:t xml:space="preserve">ISBN e ficha catalográfica (CIP). </w:t>
+      </w:r>
+      <w:r>
+        <w:rPr>
+          <w:rFonts w:ascii="Calibri" w:cs="Calibri" w:eastAsia="Calibri" w:hAnsi="Calibri"/>
+          <w:sz w:val="22"/>
+          <w:szCs w:val="22"/>
+        </w:rPr>
+        <w:t xml:space="preserve">O ISBN vem da agência e a ficha é feita por bibliotecário. Os campos continuam com marcador no livro.</w:t>
       </w:r>
     </w:p>
     <w:p>
@@ -6270,10 +7173,20 @@
       <w:r>
         <w:rPr>
           <w:rFonts w:ascii="Calibri" w:cs="Calibri" w:eastAsia="Calibri" w:hAnsi="Calibri"/>
-          <w:sz w:val="22"/>
-          <w:szCs w:val="22"/>
-        </w:rPr>
-        <w:t xml:space="preserve">Figura 5.2: usa NPV e IRR, enquanto o texto usa VPL e TIR. Padronize em português.</w:t>
+          <w:b/>
+          <w:bCs/>
+          <w:sz w:val="22"/>
+          <w:szCs w:val="22"/>
+        </w:rPr>
+        <w:t xml:space="preserve">Nota sobre as saídas de LLM. </w:t>
+      </w:r>
+      <w:r>
+        <w:rPr>
+          <w:rFonts w:ascii="Calibri" w:cs="Calibri" w:eastAsia="Calibri" w:hAnsi="Calibri"/>
+          <w:sz w:val="22"/>
+          <w:szCs w:val="22"/>
+        </w:rPr>
+        <w:t xml:space="preserve">Preencher, no campo entre colchetes antes do Prompt 6.1, a versão exata do modelo e a data de cada geração.</w:t>
       </w:r>
     </w:p>
     <w:p>
@@ -6288,10 +7201,20 @@
       <w:r>
         <w:rPr>
           <w:rFonts w:ascii="Calibri" w:cs="Calibri" w:eastAsia="Calibri" w:hAnsi="Calibri"/>
-          <w:sz w:val="22"/>
-          <w:szCs w:val="22"/>
-        </w:rPr>
-        <w:t xml:space="preserve">Saídas de LLM do Capítulo 6: informe, em uma nota geral, o modelo e a data em que cada saída foi gerada. Isso protege a obra da obsolescência e favorece a reprodutibilidade.</w:t>
+          <w:b/>
+          <w:bCs/>
+          <w:sz w:val="22"/>
+          <w:szCs w:val="22"/>
+        </w:rPr>
+        <w:t xml:space="preserve">Conferência das fontes que não consegui abrir: </w:t>
+      </w:r>
+      <w:r>
+        <w:rPr>
+          <w:rFonts w:ascii="Calibri" w:cs="Calibri" w:eastAsia="Calibri" w:hAnsi="Calibri"/>
+          <w:sz w:val="22"/>
+          <w:szCs w:val="22"/>
+        </w:rPr>
+        <w:t xml:space="preserve">PDRI (edição e ano), McKinsey (2017), PMI Sweden (76%), Menlo (amostra) e a expressão "ao menos moderado" do PMI (2023).</w:t>
       </w:r>
     </w:p>
     <w:p>
@@ -6306,67 +7229,20 @@
       <w:r>
         <w:rPr>
           <w:rFonts w:ascii="Calibri" w:cs="Calibri" w:eastAsia="Calibri" w:hAnsi="Calibri"/>
-          <w:sz w:val="22"/>
-          <w:szCs w:val="22"/>
-        </w:rPr>
-        <w:t xml:space="preserve">Os exemplos dos capítulos 5 e 6 usam valores diferentes para projetos de natureza parecida (por exemplo, o parque eólico de 150 MW tem BAC de R$ 680 milhões no Prompt 5.4 e CAPEX de R$ 900 milhões no Prompt 6.5). Por serem hipotéticos, não é erro, mas uma frase de nota evita estranheza.</w:t>
-      </w:r>
-    </w:p>
-    <w:p>
-      <w:pPr>
-        <w:pStyle w:val="Heading1"/>
-        <w:spacing w:after="140" w:before="320"/>
-      </w:pPr>
-      <w:r>
-        <w:rPr>
-          <w:rFonts w:ascii="Calibri" w:cs="Calibri" w:eastAsia="Calibri" w:hAnsi="Calibri"/>
           <w:b/>
           <w:bCs/>
-          <w:color w:val="1F3864"/>
-          <w:sz w:val="30"/>
-          <w:szCs w:val="30"/>
-        </w:rPr>
-        <w:t xml:space="preserve">7. Parecer: a obra ainda é atual e faz sentido publicar?</w:t>
-      </w:r>
-    </w:p>
-    <w:p>
-      <w:pPr>
-        <w:spacing w:after="120" w:line="276"/>
-      </w:pPr>
-      <w:r>
-        <w:rPr>
-          <w:rFonts w:ascii="Calibri" w:cs="Calibri" w:eastAsia="Calibri" w:hAnsi="Calibri"/>
-          <w:b/>
-          <w:bCs/>
-          <w:sz w:val="22"/>
-          <w:szCs w:val="22"/>
-        </w:rPr>
-        <w:t xml:space="preserve">Conclusão. </w:t>
-      </w:r>
-      <w:r>
-        <w:rPr>
-          <w:rFonts w:ascii="Calibri" w:cs="Calibri" w:eastAsia="Calibri" w:hAnsi="Calibri"/>
-          <w:sz w:val="22"/>
-          <w:szCs w:val="22"/>
-        </w:rPr>
-        <w:t xml:space="preserve">Sim, com ressalvas. A obra tem uma proposta distinta e útil, e os seus pontos fracos são corrigíveis em poucas semanas. O maior risco não é o tema, é o prazo de validade de parte do conteúdo.</w:t>
-      </w:r>
-    </w:p>
-    <w:p>
-      <w:pPr>
-        <w:pStyle w:val="Heading2"/>
-        <w:spacing w:after="100" w:before="220"/>
-      </w:pPr>
-      <w:r>
-        <w:rPr>
-          <w:rFonts w:ascii="Calibri" w:cs="Calibri" w:eastAsia="Calibri" w:hAnsi="Calibri"/>
-          <w:b/>
-          <w:bCs/>
-          <w:color w:val="2F5496"/>
-          <w:sz w:val="25"/>
-          <w:szCs w:val="25"/>
-        </w:rPr>
-        <w:t xml:space="preserve">O que sustenta a publicação</w:t>
+          <w:sz w:val="22"/>
+          <w:szCs w:val="22"/>
+        </w:rPr>
+        <w:t xml:space="preserve">Datas de acesso das referências, </w:t>
+      </w:r>
+      <w:r>
+        <w:rPr>
+          <w:rFonts w:ascii="Calibri" w:cs="Calibri" w:eastAsia="Calibri" w:hAnsi="Calibri"/>
+          <w:sz w:val="22"/>
+          <w:szCs w:val="22"/>
+        </w:rPr>
+        <w:t xml:space="preserve">depois que você conferir os links.</w:t>
       </w:r>
     </w:p>
     <w:p>
@@ -6386,15 +7262,30 @@
           <w:sz w:val="22"/>
           <w:szCs w:val="22"/>
         </w:rPr>
-        <w:t xml:space="preserve">Nicho claro e pouco ocupado em português. </w:t>
-      </w:r>
-      <w:r>
-        <w:rPr>
-          <w:rFonts w:ascii="Calibri" w:cs="Calibri" w:eastAsia="Calibri" w:hAnsi="Calibri"/>
-          <w:sz w:val="22"/>
-          <w:szCs w:val="22"/>
-        </w:rPr>
-        <w:t xml:space="preserve">Há bastante material genérico sobre IA para gerentes de projetos, mas pouco que parta do ciclo FEL e FID, de EVM, de claims e de comitês de investimento, com exemplos brasileiros (ANP, ANM, BNDES, ONS, PPP rodoviária). Esse recorte é o seu diferencial.</w:t>
+        <w:t xml:space="preserve">Confirmar no Jornal Oficial da União Europeia </w:t>
+      </w:r>
+      <w:r>
+        <w:rPr>
+          <w:rFonts w:ascii="Calibri" w:cs="Calibri" w:eastAsia="Calibri" w:hAnsi="Calibri"/>
+          <w:sz w:val="22"/>
+          <w:szCs w:val="22"/>
+        </w:rPr>
+        <w:t xml:space="preserve">o ato final do Digital Omnibus, e na ficha de tramitação o estado do PL 2338/2023 perto da impressão.</w:t>
+      </w:r>
+    </w:p>
+    <w:p>
+      <w:pPr>
+        <w:spacing w:after="120" w:line="276"/>
+      </w:pPr>
+      <w:r>
+        <w:rPr>
+          <w:rFonts w:ascii="Calibri" w:cs="Calibri" w:eastAsia="Calibri" w:hAnsi="Calibri"/>
+          <w:b/>
+          <w:bCs/>
+          <w:sz w:val="22"/>
+          <w:szCs w:val="22"/>
+        </w:rPr>
+        <w:t xml:space="preserve">Recomendadas, sem urgência</w:t>
       </w:r>
     </w:p>
     <w:p>
@@ -6409,20 +7300,10 @@
       <w:r>
         <w:rPr>
           <w:rFonts w:ascii="Calibri" w:cs="Calibri" w:eastAsia="Calibri" w:hAnsi="Calibri"/>
-          <w:b/>
-          <w:bCs/>
-          <w:sz w:val="22"/>
-          <w:szCs w:val="22"/>
-        </w:rPr>
-        <w:t xml:space="preserve">Método que envelhece devagar. </w:t>
-      </w:r>
-      <w:r>
-        <w:rPr>
-          <w:rFonts w:ascii="Calibri" w:cs="Calibri" w:eastAsia="Calibri" w:hAnsi="Calibri"/>
-          <w:sz w:val="22"/>
-          <w:szCs w:val="22"/>
-        </w:rPr>
-        <w:t xml:space="preserve">A lógica de FEL, de gates e de governança muda em décadas; os modelos mudam em meses. Um livro ancorado no método e usando a tecnologia como ferramenta tem vida útil maior do que um manual de ferramentas.</w:t>
+          <w:sz w:val="22"/>
+          <w:szCs w:val="22"/>
+        </w:rPr>
+        <w:t xml:space="preserve">Fazer a conferência do Microsoft Agent Framework e das demais menções a ferramentas, que mudam rápido.</w:t>
       </w:r>
     </w:p>
     <w:p>
@@ -6437,20 +7318,67 @@
       <w:r>
         <w:rPr>
           <w:rFonts w:ascii="Calibri" w:cs="Calibri" w:eastAsia="Calibri" w:hAnsi="Calibri"/>
+          <w:sz w:val="22"/>
+          <w:szCs w:val="22"/>
+        </w:rPr>
+        <w:t xml:space="preserve">Se a página da Figura 5.3 continuar a girar o painel em 90 graus, vale testar se a leitura fica confortável na versão impressa; a rotação é a mesma que você já usava.</w:t>
+      </w:r>
+    </w:p>
+    <w:p>
+      <w:pPr>
+        <w:pStyle w:val="Heading1"/>
+        <w:spacing w:after="140" w:before="320"/>
+      </w:pPr>
+      <w:r>
+        <w:rPr>
+          <w:rFonts w:ascii="Calibri" w:cs="Calibri" w:eastAsia="Calibri" w:hAnsi="Calibri"/>
           <w:b/>
           <w:bCs/>
-          <w:sz w:val="22"/>
-          <w:szCs w:val="22"/>
-        </w:rPr>
-        <w:t xml:space="preserve">Momento favorável. </w:t>
-      </w:r>
-      <w:r>
-        <w:rPr>
-          <w:rFonts w:ascii="Calibri" w:cs="Calibri" w:eastAsia="Calibri" w:hAnsi="Calibri"/>
-          <w:sz w:val="22"/>
-          <w:szCs w:val="22"/>
-        </w:rPr>
-        <w:t xml:space="preserve">O PMBOK 8 (novembro de 2025) incorporou IA, e o tema está no centro do debate de PMOs. O mercado está atento, e os livros especializados ainda são poucos.</w:t>
+          <w:color w:val="1F3864"/>
+          <w:sz w:val="30"/>
+          <w:szCs w:val="30"/>
+        </w:rPr>
+        <w:t xml:space="preserve">7. Parecer: a obra ainda é atual e faz sentido publicar?</w:t>
+      </w:r>
+    </w:p>
+    <w:p>
+      <w:pPr>
+        <w:spacing w:after="120" w:line="276"/>
+      </w:pPr>
+      <w:r>
+        <w:rPr>
+          <w:rFonts w:ascii="Calibri" w:cs="Calibri" w:eastAsia="Calibri" w:hAnsi="Calibri"/>
+          <w:b/>
+          <w:bCs/>
+          <w:sz w:val="22"/>
+          <w:szCs w:val="22"/>
+        </w:rPr>
+        <w:t xml:space="preserve">Conclusão. </w:t>
+      </w:r>
+      <w:r>
+        <w:rPr>
+          <w:rFonts w:ascii="Calibri" w:cs="Calibri" w:eastAsia="Calibri" w:hAnsi="Calibri"/>
+          <w:sz w:val="22"/>
+          <w:szCs w:val="22"/>
+        </w:rPr>
+        <w:t xml:space="preserve">Sim, com ressalvas. A obra tem uma proposta distinta e útil, e os seus pontos fracos são corrigíveis em poucas semanas. O maior risco não é o tema, é o prazo de validade de parte do conteúdo.</w:t>
+      </w:r>
+    </w:p>
+    <w:p>
+      <w:pPr>
+        <w:pStyle w:val="Heading2"/>
+        <w:spacing w:after="100" w:before="220"/>
+      </w:pPr>
+      <w:r>
+        <w:rPr>
+          <w:rFonts w:ascii="Calibri" w:cs="Calibri" w:eastAsia="Calibri" w:hAnsi="Calibri"/>
+          <w:b/>
+          <w:bCs/>
+          <w:color w:val="2F5496"/>
+          <w:sz w:val="25"/>
+          <w:szCs w:val="25"/>
+        </w:rPr>
+        <w:t xml:space="preserve">O que sustenta a publicação</w:t>
       </w:r>
     </w:p>
     <w:p>
@@ -6470,15 +7398,15 @@
           <w:sz w:val="22"/>
           <w:szCs w:val="22"/>
         </w:rPr>
-        <w:t xml:space="preserve">Postura responsável e honesta. </w:t>
-      </w:r>
-      <w:r>
-        <w:rPr>
-          <w:rFonts w:ascii="Calibri" w:cs="Calibri" w:eastAsia="Calibri" w:hAnsi="Calibri"/>
-          <w:sz w:val="22"/>
-          <w:szCs w:val="22"/>
-        </w:rPr>
-        <w:t xml:space="preserve">O livro insiste em validação humana, rastreabilidade, LGPD, vieses e limites, e os prompts mandam a IA não inventar valores. Isso reduz risco reputacional e dá credibilidade perante comitês e áreas de compliance.</w:t>
+        <w:t xml:space="preserve">Nicho claro e pouco ocupado em português. </w:t>
+      </w:r>
+      <w:r>
+        <w:rPr>
+          <w:rFonts w:ascii="Calibri" w:cs="Calibri" w:eastAsia="Calibri" w:hAnsi="Calibri"/>
+          <w:sz w:val="22"/>
+          <w:szCs w:val="22"/>
+        </w:rPr>
+        <w:t xml:space="preserve">Há bastante material genérico sobre IA para gerentes de projetos, mas pouco que parta do ciclo FEL e FID, de EVM, de claims e de comitês de investimento, com exemplos brasileiros (ANP, ANM, BNDES, ONS, PPP rodoviária). Esse recorte é o seu diferencial.</w:t>
       </w:r>
     </w:p>
     <w:p>
@@ -6498,32 +7426,15 @@
           <w:sz w:val="22"/>
           <w:szCs w:val="22"/>
         </w:rPr>
-        <w:t xml:space="preserve">Estrutura didática. </w:t>
-      </w:r>
-      <w:r>
-        <w:rPr>
-          <w:rFonts w:ascii="Calibri" w:cs="Calibri" w:eastAsia="Calibri" w:hAnsi="Calibri"/>
-          <w:sz w:val="22"/>
-          <w:szCs w:val="22"/>
-        </w:rPr>
-        <w:t xml:space="preserve">O RCTIF é simples de memorizar, os seis casos cobrem setores diferentes, e cada caso traz prompt, saída, tabela de entregáveis e limitações.</w:t>
-      </w:r>
-    </w:p>
-    <w:p>
-      <w:pPr>
-        <w:pStyle w:val="Heading2"/>
-        <w:spacing w:after="100" w:before="220"/>
-      </w:pPr>
-      <w:r>
-        <w:rPr>
-          <w:rFonts w:ascii="Calibri" w:cs="Calibri" w:eastAsia="Calibri" w:hAnsi="Calibri"/>
-          <w:b/>
-          <w:bCs/>
-          <w:color w:val="2F5496"/>
-          <w:sz w:val="25"/>
-          <w:szCs w:val="25"/>
-        </w:rPr>
-        <w:t xml:space="preserve">Riscos e fragilidades</w:t>
+        <w:t xml:space="preserve">Método que envelhece devagar. </w:t>
+      </w:r>
+      <w:r>
+        <w:rPr>
+          <w:rFonts w:ascii="Calibri" w:cs="Calibri" w:eastAsia="Calibri" w:hAnsi="Calibri"/>
+          <w:sz w:val="22"/>
+          <w:szCs w:val="22"/>
+        </w:rPr>
+        <w:t xml:space="preserve">A lógica de FEL, de gates e de governança muda em décadas; os modelos mudam em meses. Um livro ancorado no método e usando a tecnologia como ferramenta tem vida útil maior do que um manual de ferramentas.</w:t>
       </w:r>
     </w:p>
     <w:p>
@@ -6543,15 +7454,15 @@
           <w:sz w:val="22"/>
           <w:szCs w:val="22"/>
         </w:rPr>
-        <w:t xml:space="preserve">Conteúdo volátil. </w:t>
-      </w:r>
-      <w:r>
-        <w:rPr>
-          <w:rFonts w:ascii="Calibri" w:cs="Calibri" w:eastAsia="Calibri" w:hAnsi="Calibri"/>
-          <w:sz w:val="22"/>
-          <w:szCs w:val="22"/>
-        </w:rPr>
-        <w:t xml:space="preserve">A Tabela 4.1, a Figura 4.2 e a Tabela 7.3 citam plataformas e versões de 2026. Em seis a doze meses estarão desatualizadas.</w:t>
+        <w:t xml:space="preserve">Momento favorável. </w:t>
+      </w:r>
+      <w:r>
+        <w:rPr>
+          <w:rFonts w:ascii="Calibri" w:cs="Calibri" w:eastAsia="Calibri" w:hAnsi="Calibri"/>
+          <w:sz w:val="22"/>
+          <w:szCs w:val="22"/>
+        </w:rPr>
+        <w:t xml:space="preserve">O PMBOK 8 (novembro de 2025) incorporou IA, e o tema está no centro do debate de PMOs. O mercado está atento, e os livros especializados ainda são poucos.</w:t>
       </w:r>
     </w:p>
     <w:p>
@@ -6571,15 +7482,15 @@
           <w:sz w:val="22"/>
           <w:szCs w:val="22"/>
         </w:rPr>
-        <w:t xml:space="preserve">Enquadramento centrado em "prompt". </w:t>
-      </w:r>
-      <w:r>
-        <w:rPr>
-          <w:rFonts w:ascii="Calibri" w:cs="Calibri" w:eastAsia="Calibri" w:hAnsi="Calibri"/>
-          <w:sz w:val="22"/>
-          <w:szCs w:val="22"/>
-        </w:rPr>
-        <w:t xml:space="preserve">O centro de gravidade da prática já se deslocou do prompt isolado para fluxos com contexto, ferramentas e verificação (agentes, MCP, "skills", engenharia de contexto). O livro reconhece isso no Capítulo 7 e agora também no fim do Capítulo 4, mas o miolo (capítulos 4 a 6) ainda trata o prompt de sessão única como unidade principal. Técnicas como Chain-of-Thought e Tree-of-Thought, úteis há dois anos, são menos centrais com modelos que já raciocinam por conta própria.</w:t>
+        <w:t xml:space="preserve">Postura responsável e honesta. </w:t>
+      </w:r>
+      <w:r>
+        <w:rPr>
+          <w:rFonts w:ascii="Calibri" w:cs="Calibri" w:eastAsia="Calibri" w:hAnsi="Calibri"/>
+          <w:sz w:val="22"/>
+          <w:szCs w:val="22"/>
+        </w:rPr>
+        <w:t xml:space="preserve">O livro insiste em validação humana, rastreabilidade, LGPD, vieses e limites, e os prompts mandam a IA não inventar valores. Isso reduz risco reputacional e dá credibilidade perante comitês e áreas de compliance.</w:t>
       </w:r>
     </w:p>
     <w:p>
@@ -6599,15 +7510,32 @@
           <w:sz w:val="22"/>
           <w:szCs w:val="22"/>
         </w:rPr>
-        <w:t xml:space="preserve">Ausência de evidência própria. </w:t>
-      </w:r>
-      <w:r>
-        <w:rPr>
-          <w:rFonts w:ascii="Calibri" w:cs="Calibri" w:eastAsia="Calibri" w:hAnsi="Calibri"/>
-          <w:sz w:val="22"/>
-          <w:szCs w:val="22"/>
-        </w:rPr>
-        <w:t xml:space="preserve">Os ganhos são descritos como "potenciais", sem medição. Em 2026 o leitor sênior espera ao menos um protocolo de piloto, métricas (tempo, taxa de erro, retrabalho) e uma avaliação das saídas dos casos.</w:t>
+        <w:t xml:space="preserve">Estrutura didática. </w:t>
+      </w:r>
+      <w:r>
+        <w:rPr>
+          <w:rFonts w:ascii="Calibri" w:cs="Calibri" w:eastAsia="Calibri" w:hAnsi="Calibri"/>
+          <w:sz w:val="22"/>
+          <w:szCs w:val="22"/>
+        </w:rPr>
+        <w:t xml:space="preserve">O RCTIF é simples de memorizar, os seis casos cobrem setores diferentes, e cada caso traz prompt, saída, tabela de entregáveis e limitações.</w:t>
+      </w:r>
+    </w:p>
+    <w:p>
+      <w:pPr>
+        <w:pStyle w:val="Heading2"/>
+        <w:spacing w:after="100" w:before="220"/>
+      </w:pPr>
+      <w:r>
+        <w:rPr>
+          <w:rFonts w:ascii="Calibri" w:cs="Calibri" w:eastAsia="Calibri" w:hAnsi="Calibri"/>
+          <w:b/>
+          <w:bCs/>
+          <w:color w:val="2F5496"/>
+          <w:sz w:val="25"/>
+          <w:szCs w:val="25"/>
+        </w:rPr>
+        <w:t xml:space="preserve">Riscos e fragilidades</w:t>
       </w:r>
     </w:p>
     <w:p>
@@ -6627,15 +7555,15 @@
           <w:sz w:val="22"/>
           <w:szCs w:val="22"/>
         </w:rPr>
-        <w:t xml:space="preserve">Cálculos feitos por LLM. </w:t>
-      </w:r>
-      <w:r>
-        <w:rPr>
-          <w:rFonts w:ascii="Calibri" w:cs="Calibri" w:eastAsia="Calibri" w:hAnsi="Calibri"/>
-          <w:sz w:val="22"/>
-          <w:szCs w:val="22"/>
-        </w:rPr>
-        <w:t xml:space="preserve">Vários prompts pedem EVM, EAC, Monte Carlo e valor presente. Modelos de linguagem erram aritmética. O livro precisa dizer, de forma explícita e repetida, que números devem ser recalculados em planilha ou código e que a saída do LLM deve ser tratada como rascunho.</w:t>
+        <w:t xml:space="preserve">Conteúdo volátil. </w:t>
+      </w:r>
+      <w:r>
+        <w:rPr>
+          <w:rFonts w:ascii="Calibri" w:cs="Calibri" w:eastAsia="Calibri" w:hAnsi="Calibri"/>
+          <w:sz w:val="22"/>
+          <w:szCs w:val="22"/>
+        </w:rPr>
+        <w:t xml:space="preserve">A Tabela 4.1, a Figura 4.2 e a Tabela 7.3 citam plataformas e versões de 2026. Em seis a doze meses estarão desatualizadas.</w:t>
       </w:r>
     </w:p>
     <w:p>
@@ -6655,15 +7583,15 @@
           <w:sz w:val="22"/>
           <w:szCs w:val="22"/>
         </w:rPr>
-        <w:t xml:space="preserve">Base bibliográfica heterogênea. </w:t>
-      </w:r>
-      <w:r>
-        <w:rPr>
-          <w:rFonts w:ascii="Calibri" w:cs="Calibri" w:eastAsia="Calibri" w:hAnsi="Calibri"/>
-          <w:sz w:val="22"/>
-          <w:szCs w:val="22"/>
-        </w:rPr>
-        <w:t xml:space="preserve">Há boas fontes (CII, AACE, Flyvbjerg, NIST, EU AI Act), mas também material de consultorias e blogs, e alguns números sem confirmação direta. Para um público de comitês, vale reforçar com fontes primárias.</w:t>
+        <w:t xml:space="preserve">Enquadramento centrado em "prompt". </w:t>
+      </w:r>
+      <w:r>
+        <w:rPr>
+          <w:rFonts w:ascii="Calibri" w:cs="Calibri" w:eastAsia="Calibri" w:hAnsi="Calibri"/>
+          <w:sz w:val="22"/>
+          <w:szCs w:val="22"/>
+        </w:rPr>
+        <w:t xml:space="preserve">O centro de gravidade da prática já se deslocou do prompt isolado para fluxos com contexto, ferramentas e verificação (agentes, MCP, "skills", engenharia de contexto). O livro reconhece isso no Capítulo 7 e agora também no fim do Capítulo 4, mas o miolo (capítulos 4 a 6) ainda trata o prompt de sessão única como unidade principal. Técnicas como Chain-of-Thought e Tree-of-Thought, úteis há dois anos, são menos centrais com modelos que já raciocinam por conta própria.</w:t>
       </w:r>
     </w:p>
     <w:p>
@@ -6683,32 +7611,15 @@
           <w:sz w:val="22"/>
           <w:szCs w:val="22"/>
         </w:rPr>
-        <w:t xml:space="preserve">Regulação em movimento. </w:t>
-      </w:r>
-      <w:r>
-        <w:rPr>
-          <w:rFonts w:ascii="Calibri" w:cs="Calibri" w:eastAsia="Calibri" w:hAnsi="Calibri"/>
-          <w:sz w:val="22"/>
-          <w:szCs w:val="22"/>
-        </w:rPr>
-        <w:t xml:space="preserve">PL 2338/2023 e AI Act mudam de situação. O livro já é cauteloso ("na data de revisão"), o que ajuda.</w:t>
-      </w:r>
-    </w:p>
-    <w:p>
-      <w:pPr>
-        <w:pStyle w:val="Heading2"/>
-        <w:spacing w:after="100" w:before="220"/>
-      </w:pPr>
-      <w:r>
-        <w:rPr>
-          <w:rFonts w:ascii="Calibri" w:cs="Calibri" w:eastAsia="Calibri" w:hAnsi="Calibri"/>
-          <w:b/>
-          <w:bCs/>
-          <w:color w:val="2F5496"/>
-          <w:sz w:val="25"/>
-          <w:szCs w:val="25"/>
-        </w:rPr>
-        <w:t xml:space="preserve">Recomendações, em ordem de prioridade</w:t>
+        <w:t xml:space="preserve">Ausência de evidência própria. </w:t>
+      </w:r>
+      <w:r>
+        <w:rPr>
+          <w:rFonts w:ascii="Calibri" w:cs="Calibri" w:eastAsia="Calibri" w:hAnsi="Calibri"/>
+          <w:sz w:val="22"/>
+          <w:szCs w:val="22"/>
+        </w:rPr>
+        <w:t xml:space="preserve">Os ganhos são descritos como "potenciais", sem medição. Em 2026 o leitor sênior espera ao menos um protocolo de piloto, métricas (tempo, taxa de erro, retrabalho) e uma avaliação das saídas dos casos.</w:t>
       </w:r>
     </w:p>
     <w:p>
@@ -6728,15 +7639,116 @@
           <w:sz w:val="22"/>
           <w:szCs w:val="22"/>
         </w:rPr>
-        <w:t xml:space="preserve">1. Fechar as pendências da seção 6 </w:t>
-      </w:r>
-      <w:r>
-        <w:rPr>
-          <w:rFonts w:ascii="Calibri" w:cs="Calibri" w:eastAsia="Calibri" w:hAnsi="Calibri"/>
-          <w:sz w:val="22"/>
-          <w:szCs w:val="22"/>
-        </w:rPr>
-        <w:t xml:space="preserve">(fatos, Figura 5.3, Figura 1.1, ISBN e ficha, sumário). É o que separa uma versão de revisão de uma versão publicável.</w:t>
+        <w:t xml:space="preserve">Cálculos feitos por LLM. </w:t>
+      </w:r>
+      <w:r>
+        <w:rPr>
+          <w:rFonts w:ascii="Calibri" w:cs="Calibri" w:eastAsia="Calibri" w:hAnsi="Calibri"/>
+          <w:sz w:val="22"/>
+          <w:szCs w:val="22"/>
+        </w:rPr>
+        <w:t xml:space="preserve">Vários prompts pedem EVM, EAC, Monte Carlo e valor presente. Modelos de linguagem erram aritmética. O livro precisa dizer, de forma explícita e repetida, que números devem ser recalculados em planilha ou código e que a saída do LLM deve ser tratada como rascunho.</w:t>
+      </w:r>
+    </w:p>
+    <w:p>
+      <w:pPr>
+        <w:pStyle w:val="ListParagraph"/>
+        <w:numPr>
+          <w:ilvl w:val="0"/>
+          <w:numId w:val="2"/>
+        </w:numPr>
+        <w:spacing w:after="70" w:line="264"/>
+      </w:pPr>
+      <w:r>
+        <w:rPr>
+          <w:rFonts w:ascii="Calibri" w:cs="Calibri" w:eastAsia="Calibri" w:hAnsi="Calibri"/>
+          <w:b/>
+          <w:bCs/>
+          <w:sz w:val="22"/>
+          <w:szCs w:val="22"/>
+        </w:rPr>
+        <w:t xml:space="preserve">Base bibliográfica heterogênea. </w:t>
+      </w:r>
+      <w:r>
+        <w:rPr>
+          <w:rFonts w:ascii="Calibri" w:cs="Calibri" w:eastAsia="Calibri" w:hAnsi="Calibri"/>
+          <w:sz w:val="22"/>
+          <w:szCs w:val="22"/>
+        </w:rPr>
+        <w:t xml:space="preserve">Há boas fontes (CII, AACE, Flyvbjerg, NIST, EU AI Act), mas também material de consultorias e blogs, e alguns números sem confirmação direta. Para um público de comitês, vale reforçar com fontes primárias.</w:t>
+      </w:r>
+    </w:p>
+    <w:p>
+      <w:pPr>
+        <w:pStyle w:val="ListParagraph"/>
+        <w:numPr>
+          <w:ilvl w:val="0"/>
+          <w:numId w:val="2"/>
+        </w:numPr>
+        <w:spacing w:after="70" w:line="264"/>
+      </w:pPr>
+      <w:r>
+        <w:rPr>
+          <w:rFonts w:ascii="Calibri" w:cs="Calibri" w:eastAsia="Calibri" w:hAnsi="Calibri"/>
+          <w:b/>
+          <w:bCs/>
+          <w:sz w:val="22"/>
+          <w:szCs w:val="22"/>
+        </w:rPr>
+        <w:t xml:space="preserve">Regulação em movimento. </w:t>
+      </w:r>
+      <w:r>
+        <w:rPr>
+          <w:rFonts w:ascii="Calibri" w:cs="Calibri" w:eastAsia="Calibri" w:hAnsi="Calibri"/>
+          <w:sz w:val="22"/>
+          <w:szCs w:val="22"/>
+        </w:rPr>
+        <w:t xml:space="preserve">PL 2338/2023 e AI Act mudam de situação. O livro já é cauteloso ("na data de revisão"), o que ajuda.</w:t>
+      </w:r>
+    </w:p>
+    <w:p>
+      <w:pPr>
+        <w:pStyle w:val="Heading2"/>
+        <w:spacing w:after="100" w:before="220"/>
+      </w:pPr>
+      <w:r>
+        <w:rPr>
+          <w:rFonts w:ascii="Calibri" w:cs="Calibri" w:eastAsia="Calibri" w:hAnsi="Calibri"/>
+          <w:b/>
+          <w:bCs/>
+          <w:color w:val="2F5496"/>
+          <w:sz w:val="25"/>
+          <w:szCs w:val="25"/>
+        </w:rPr>
+        <w:t xml:space="preserve">Recomendações, em ordem de prioridade</w:t>
+      </w:r>
+    </w:p>
+    <w:p>
+      <w:pPr>
+        <w:pStyle w:val="ListParagraph"/>
+        <w:numPr>
+          <w:ilvl w:val="0"/>
+          <w:numId w:val="2"/>
+        </w:numPr>
+        <w:spacing w:after="70" w:line="264"/>
+      </w:pPr>
+      <w:r>
+        <w:rPr>
+          <w:rFonts w:ascii="Calibri" w:cs="Calibri" w:eastAsia="Calibri" w:hAnsi="Calibri"/>
+          <w:b/>
+          <w:bCs/>
+          <w:sz w:val="22"/>
+          <w:szCs w:val="22"/>
+        </w:rPr>
+        <w:t xml:space="preserve">1. Fechar as pendências que restam na seção 6 </w:t>
+      </w:r>
+      <w:r>
+        <w:rPr>
+          <w:rFonts w:ascii="Calibri" w:cs="Calibri" w:eastAsia="Calibri" w:hAnsi="Calibri"/>
+          <w:sz w:val="22"/>
+          <w:szCs w:val="22"/>
+        </w:rPr>
+        <w:t xml:space="preserve">(ISBN e ficha, conferência das fontes, datas de acesso, nota das saídas de LLM). É o que separa uma versão de revisão de uma versão publicável.</w:t>
       </w:r>
     </w:p>
     <w:p>

</xml_diff>

<commit_message>
Segunda passada de edição nos Capítulos 5 e 6; padronização de legendas e tabelas
- Modera afirmações absolutas, desmembra frases longas e remove repetições
- Alinha os benefícios dos casos à cautela sobre cálculos feitos por LLM
- Padroniza legendas e cabeçalhos de tabelas
- Atualiza o relatório

Co-Authored-By: Claude Sonnet 5.5 <noreply@anthropic.com>
Claude-Session: https://claude.ai/code/session_01QyVuLhMLANWbd77ToAWS1S
</commit_message>
<xml_diff>
--- a/revisao_editorial/Relatorio_Revisao_e_Parecer.docx
+++ b/revisao_editorial/Relatorio_Revisao_e_Parecer.docx
@@ -180,7 +180,7 @@
           <w:sz w:val="22"/>
           <w:szCs w:val="22"/>
         </w:rPr>
-        <w:t xml:space="preserve">Foram eliminadas todas as ocorrências de travessão: 207 travessões longos, 3 meios-travessões e cerca de 210 hífens com espaços usados como travessão, além de 30 marcadores de lista digitados com hífen, trocados por marcadores tipográficos. Restam zero no texto. No total, 515 parágrafos foram alterados (cerca de 26% dos parágrafos com texto), 4 parágrafos redundantes foram consolidados, 2 parágrafos novos foram acrescentados (nota sobre saídas de LLM e cautela sobre cálculos), 10 siglas entraram no glossário e 5 figuras foram corrigidas ou recriadas.</w:t>
+        <w:t xml:space="preserve">Foram eliminadas todas as ocorrências de travessão: 207 travessões longos, 3 meios-travessões e cerca de 210 hífens com espaços usados como travessão, além de 30 marcadores de lista digitados com hífen, trocados por marcadores tipográficos. Restam zero no texto. No total, 540 parágrafos foram alterados (cerca de 28% dos parágrafos com texto), 4 parágrafos redundantes foram consolidados, 2 parágrafos novos foram acrescentados (nota sobre saídas de LLM e cautela sobre cálculos), 10 siglas entraram no glossário e 5 figuras foram corrigidas ou recriadas.</w:t>
       </w:r>
     </w:p>
     <w:p>
@@ -2867,6 +2867,144 @@
           <w:szCs w:val="22"/>
         </w:rPr>
         <w:t xml:space="preserve">Capítulo 3, gestão de riscos: dois parágrafos quase idênticos viraram um.</w:t>
+      </w:r>
+    </w:p>
+    <w:p>
+      <w:pPr>
+        <w:pStyle w:val="Heading2"/>
+        <w:spacing w:after="100" w:before="220"/>
+      </w:pPr>
+      <w:r>
+        <w:rPr>
+          <w:rFonts w:ascii="Calibri" w:cs="Calibri" w:eastAsia="Calibri" w:hAnsi="Calibri"/>
+          <w:b/>
+          <w:bCs/>
+          <w:color w:val="2F5496"/>
+          <w:sz w:val="25"/>
+          <w:szCs w:val="25"/>
+        </w:rPr>
+        <w:t xml:space="preserve">Segunda passada nos Capítulos 5 e 6</w:t>
+      </w:r>
+    </w:p>
+    <w:p>
+      <w:pPr>
+        <w:spacing w:after="120" w:line="276"/>
+      </w:pPr>
+      <w:r>
+        <w:rPr>
+          <w:rFonts w:ascii="Calibri" w:cs="Calibri" w:eastAsia="Calibri" w:hAnsi="Calibri"/>
+          <w:sz w:val="22"/>
+          <w:szCs w:val="22"/>
+        </w:rPr>
+        <w:t xml:space="preserve">Depois da primeira rodada, fiz uma leitura mais fina dos textos explicativos dos Capítulos 5 e 6 (fora dos quadros de prompts e das saídas de LLM, que preservei). Os ajustes principais foram:</w:t>
+      </w:r>
+    </w:p>
+    <w:p>
+      <w:pPr>
+        <w:pStyle w:val="ListParagraph"/>
+        <w:numPr>
+          <w:ilvl w:val="0"/>
+          <w:numId w:val="2"/>
+        </w:numPr>
+        <w:spacing w:after="70" w:line="264"/>
+      </w:pPr>
+      <w:r>
+        <w:rPr>
+          <w:rFonts w:ascii="Calibri" w:cs="Calibri" w:eastAsia="Calibri" w:hAnsi="Calibri"/>
+          <w:sz w:val="22"/>
+          <w:szCs w:val="22"/>
+        </w:rPr>
+        <w:t xml:space="preserve">Afirmações absolutas ou promessas de resultado trocadas por formulações compatíveis com a tese do livro (por exemplo, "receberá uma análise significativamente mais precisa" virou "tende a receber uma análise mais precisa"; "irrelevantes em O&amp;G" virou "menos centrais em O&amp;G").</w:t>
+      </w:r>
+    </w:p>
+    <w:p>
+      <w:pPr>
+        <w:pStyle w:val="ListParagraph"/>
+        <w:numPr>
+          <w:ilvl w:val="0"/>
+          <w:numId w:val="2"/>
+        </w:numPr>
+        <w:spacing w:after="70" w:line="264"/>
+      </w:pPr>
+      <w:r>
+        <w:rPr>
+          <w:rFonts w:ascii="Calibri" w:cs="Calibri" w:eastAsia="Calibri" w:hAnsi="Calibri"/>
+          <w:sz w:val="22"/>
+          <w:szCs w:val="22"/>
+        </w:rPr>
+        <w:t xml:space="preserve">Coerência com a nova cautela sobre cálculos: nos benefícios do caso de NPT, "calcular imediatamente" passou a "obter rapidamente uma primeira estimativa, que deve ser conferida em planilha"; no painel de execução, a resposta da IA é descrita como rascunho a validar.</w:t>
+      </w:r>
+    </w:p>
+    <w:p>
+      <w:pPr>
+        <w:pStyle w:val="ListParagraph"/>
+        <w:numPr>
+          <w:ilvl w:val="0"/>
+          <w:numId w:val="2"/>
+        </w:numPr>
+        <w:spacing w:after="70" w:line="264"/>
+      </w:pPr>
+      <w:r>
+        <w:rPr>
+          <w:rFonts w:ascii="Calibri" w:cs="Calibri" w:eastAsia="Calibri" w:hAnsi="Calibri"/>
+          <w:sz w:val="22"/>
+          <w:szCs w:val="22"/>
+        </w:rPr>
+        <w:t xml:space="preserve">Frases longas desmembradas (por exemplo, a dinâmica entre especificidade e abertura exploratória no FEL 2 e FEL 3), vírgulas de parêntese corrigidas, repetições removidas ("A Figura 6.2 sintetiza..." seguida de "a Figura 6.2 mostra...") e expressões pouco naturais trocadas ("Vamos ao exemplo" virou "Segue um exemplo", "endereçar" virou "tratar").</w:t>
+      </w:r>
+    </w:p>
+    <w:p>
+      <w:pPr>
+        <w:pStyle w:val="ListParagraph"/>
+        <w:numPr>
+          <w:ilvl w:val="0"/>
+          <w:numId w:val="2"/>
+        </w:numPr>
+        <w:spacing w:after="70" w:line="264"/>
+      </w:pPr>
+      <w:r>
+        <w:rPr>
+          <w:rFonts w:ascii="Calibri" w:cs="Calibri" w:eastAsia="Calibri" w:hAnsi="Calibri"/>
+          <w:sz w:val="22"/>
+          <w:szCs w:val="22"/>
+        </w:rPr>
+        <w:t xml:space="preserve">Imprecisão: "evoluem de forma inversamente proporcional" virou "tendem a evoluir em sentidos opostos", já que as curvas se aproximam no Encerramento.</w:t>
+      </w:r>
+    </w:p>
+    <w:p>
+      <w:pPr>
+        <w:pStyle w:val="ListParagraph"/>
+        <w:numPr>
+          <w:ilvl w:val="0"/>
+          <w:numId w:val="2"/>
+        </w:numPr>
+        <w:spacing w:after="70" w:line="264"/>
+      </w:pPr>
+      <w:r>
+        <w:rPr>
+          <w:rFonts w:ascii="Calibri" w:cs="Calibri" w:eastAsia="Calibri" w:hAnsi="Calibri"/>
+          <w:sz w:val="22"/>
+          <w:szCs w:val="22"/>
+        </w:rPr>
+        <w:t xml:space="preserve">Legendas padronizadas: iniciais maiúsculas só onde cabem, sem ponto final (por exemplo, "Dashboard ilustrativo de monitoramento preditivo na execução com IA").</w:t>
+      </w:r>
+    </w:p>
+    <w:p>
+      <w:pPr>
+        <w:pStyle w:val="ListParagraph"/>
+        <w:numPr>
+          <w:ilvl w:val="0"/>
+          <w:numId w:val="2"/>
+        </w:numPr>
+        <w:spacing w:after="70" w:line="264"/>
+      </w:pPr>
+      <w:r>
+        <w:rPr>
+          <w:rFonts w:ascii="Calibri" w:cs="Calibri" w:eastAsia="Calibri" w:hAnsi="Calibri"/>
+          <w:sz w:val="22"/>
+          <w:szCs w:val="22"/>
+        </w:rPr>
+        <w:t xml:space="preserve">Cabeçalhos de tabelas padronizados em caixa baixa após a primeira palavra; na Tabela 3.1, a coluna "Exemplo Real" virou "Exemplo de uso", o prefixo redundante "Exemplo:" saiu das células e o "N/D" virou "Ver Capítulos 5 e 6".</w:t>
       </w:r>
     </w:p>
     <w:p>

</xml_diff>

<commit_message>
Integra o Apêndice A (panorama datado) ao manuscrito
- Move Figura 4.2, Tabela 4.1 e descrição das plataformas para o apêndice
- Tabelas 3.1 e 7.3 passam a remeter ao apêndice (Tabelas A.2 e A.3)
- Nova seção do Word depois das Referências, com cabeçalho e sumário próprios
- Renumera Figuras 4.3 e 4.4 para 4.2 e 4.3
- Atualiza o relatório

Co-Authored-By: Claude Sonnet 5.5 <noreply@anthropic.com>
Claude-Session: https://claude.ai/code/session_01QyVuLhMLANWbd77ToAWS1S
</commit_message>
<xml_diff>
--- a/revisao_editorial/Relatorio_Revisao_e_Parecer.docx
+++ b/revisao_editorial/Relatorio_Revisao_e_Parecer.docx
@@ -180,7 +180,7 @@
           <w:sz w:val="22"/>
           <w:szCs w:val="22"/>
         </w:rPr>
-        <w:t xml:space="preserve">Foram eliminadas todas as ocorrências de travessão: 207 travessões longos, 3 meios-travessões e cerca de 210 hífens com espaços usados como travessão, além de 30 marcadores de lista digitados com hífen, trocados por marcadores tipográficos. Restam zero no texto. No total, 540 parágrafos foram alterados (cerca de 28% dos parágrafos com texto), 4 parágrafos redundantes foram consolidados, 2 parágrafos novos foram acrescentados (nota sobre saídas de LLM e cautela sobre cálculos), 10 siglas entraram no glossário e 5 figuras foram corrigidas ou recriadas.</w:t>
+        <w:t xml:space="preserve">Foram eliminadas todas as ocorrências de travessão: 207 travessões longos, 3 meios-travessões e cerca de 210 hífens com espaços usados como travessão, além de 30 marcadores de lista digitados com hífen, trocados por marcadores tipográficos. Restam zero no texto. No total, 550 parágrafos foram alterados (cerca de 28% dos parágrafos com texto), 4 parágrafos redundantes foram consolidados, 2 parágrafos novos foram acrescentados (nota sobre saídas de LLM e cautela sobre cálculos), 10 siglas entraram no glossário e 5 figuras foram corrigidas ou recriadas.</w:t>
       </w:r>
     </w:p>
     <w:p>
@@ -3005,6 +3005,126 @@
           <w:szCs w:val="22"/>
         </w:rPr>
         <w:t xml:space="preserve">Cabeçalhos de tabelas padronizados em caixa baixa após a primeira palavra; na Tabela 3.1, a coluna "Exemplo Real" virou "Exemplo de uso", o prefixo redundante "Exemplo:" saiu das células e o "N/D" virou "Ver Capítulos 5 e 6".</w:t>
+      </w:r>
+    </w:p>
+    <w:p>
+      <w:pPr>
+        <w:pStyle w:val="Heading2"/>
+        <w:spacing w:after="100" w:before="220"/>
+      </w:pPr>
+      <w:r>
+        <w:rPr>
+          <w:rFonts w:ascii="Calibri" w:cs="Calibri" w:eastAsia="Calibri" w:hAnsi="Calibri"/>
+          <w:b/>
+          <w:bCs/>
+          <w:color w:val="2F5496"/>
+          <w:sz w:val="25"/>
+          <w:szCs w:val="25"/>
+        </w:rPr>
+        <w:t xml:space="preserve">Apêndice A: panorama datado de plataformas e ferramentas (aplicado)</w:t>
+      </w:r>
+    </w:p>
+    <w:p>
+      <w:pPr>
+        <w:spacing w:after="120" w:line="276"/>
+      </w:pPr>
+      <w:r>
+        <w:rPr>
+          <w:rFonts w:ascii="Calibri" w:cs="Calibri" w:eastAsia="Calibri" w:hAnsi="Calibri"/>
+          <w:sz w:val="22"/>
+          <w:szCs w:val="22"/>
+        </w:rPr>
+        <w:t xml:space="preserve">A proposta aprovada foi integrada ao livro. Para que o leitor acompanhe sem perder o fio, o corpo manteve o raciocínio por capacidades, e o que envelhece rápido foi para o fim do livro, depois das Referências, com cabeçalho corrente próprio ("APÊNDICE A") e entradas no sumário.</w:t>
+      </w:r>
+    </w:p>
+    <w:p>
+      <w:pPr>
+        <w:pStyle w:val="ListParagraph"/>
+        <w:numPr>
+          <w:ilvl w:val="0"/>
+          <w:numId w:val="2"/>
+        </w:numPr>
+        <w:spacing w:after="70" w:line="264"/>
+      </w:pPr>
+      <w:r>
+        <w:rPr>
+          <w:rFonts w:ascii="Calibri" w:cs="Calibri" w:eastAsia="Calibri" w:hAnsi="Calibri"/>
+          <w:sz w:val="22"/>
+          <w:szCs w:val="22"/>
+        </w:rPr>
+        <w:t xml:space="preserve">Capítulo 4: a seção "Ferramentas de IA para Gestores de Projetos" ficou com seis parágrafos. Dois são novos e reúnem frases do texto anterior (decidir por capacidades e remissão ao apêndice); o texto sobre adoção multi-modelo e o fechamento permanecem. As Figuras 4.3 e 4.4 passaram a 4.2 e 4.3, com as cinco remissões ajustadas.</w:t>
+      </w:r>
+    </w:p>
+    <w:p>
+      <w:pPr>
+        <w:pStyle w:val="ListParagraph"/>
+        <w:numPr>
+          <w:ilvl w:val="0"/>
+          <w:numId w:val="2"/>
+        </w:numPr>
+        <w:spacing w:after="70" w:line="264"/>
+      </w:pPr>
+      <w:r>
+        <w:rPr>
+          <w:rFonts w:ascii="Calibri" w:cs="Calibri" w:eastAsia="Calibri" w:hAnsi="Calibri"/>
+          <w:sz w:val="22"/>
+          <w:szCs w:val="22"/>
+        </w:rPr>
+        <w:t xml:space="preserve">Apêndice A: A.1 visão geral (Figura A.1, antiga 4.2), A.2 comparativo (Tabela A.1, antiga 4.1), A.3 descrição das plataformas, A.4 exemplos de ferramentas (Tabela A.2, tirada da Tabela 3.1, e Tabela A.3, tirada da Tabela 7.3), A.5 critérios de escolha e reavaliação (texto novo) e A.6 histórico de atualizações. Data de referência: junho de 2026.</w:t>
+      </w:r>
+    </w:p>
+    <w:p>
+      <w:pPr>
+        <w:pStyle w:val="ListParagraph"/>
+        <w:numPr>
+          <w:ilvl w:val="0"/>
+          <w:numId w:val="2"/>
+        </w:numPr>
+        <w:spacing w:after="70" w:line="264"/>
+      </w:pPr>
+      <w:r>
+        <w:rPr>
+          <w:rFonts w:ascii="Calibri" w:cs="Calibri" w:eastAsia="Calibri" w:hAnsi="Calibri"/>
+          <w:sz w:val="22"/>
+          <w:szCs w:val="22"/>
+        </w:rPr>
+        <w:t xml:space="preserve">Capítulos 3 e 7: as Tabelas 3.1 e 7.3 perderam a coluna de exemplos de produtos e agora remetem ao apêndice. Uma correção de passagem: a frase que anunciava "cautelas de uso" na Tabela 7.3, que a tabela não tinha, foi corrigida.</w:t>
+      </w:r>
+    </w:p>
+    <w:p>
+      <w:pPr>
+        <w:pStyle w:val="ListParagraph"/>
+        <w:numPr>
+          <w:ilvl w:val="0"/>
+          <w:numId w:val="2"/>
+        </w:numPr>
+        <w:spacing w:after="70" w:line="264"/>
+      </w:pPr>
+      <w:r>
+        <w:rPr>
+          <w:rFonts w:ascii="Calibri" w:cs="Calibri" w:eastAsia="Calibri" w:hAnsi="Calibri"/>
+          <w:sz w:val="22"/>
+          <w:szCs w:val="22"/>
+        </w:rPr>
+        <w:t xml:space="preserve">Ajuste em relação à proposta: numerei as tabelas do apêndice na ordem do livro (A.2 vem do Capítulo 3 e A.3 do Capítulo 7), em vez de A.2 para os agentes e A.3 para as categorias de IA como estava no rascunho.</w:t>
+      </w:r>
+    </w:p>
+    <w:p>
+      <w:pPr>
+        <w:pStyle w:val="ListParagraph"/>
+        <w:numPr>
+          <w:ilvl w:val="0"/>
+          <w:numId w:val="2"/>
+        </w:numPr>
+        <w:spacing w:after="70" w:line="264"/>
+      </w:pPr>
+      <w:r>
+        <w:rPr>
+          <w:rFonts w:ascii="Calibri" w:cs="Calibri" w:eastAsia="Calibri" w:hAnsi="Calibri"/>
+          <w:sz w:val="22"/>
+          <w:szCs w:val="22"/>
+        </w:rPr>
+        <w:t xml:space="preserve">Sumário: as entradas do apêndice foram criadas, e os números de página se corrigem quando o Word atualizar os campos ao abrir. Na versão com alterações rastreadas, os textos novos aparecem como inserções; as movimentações de blocos e as tabelas novas ou reduzidas entram sem marca de revisão, e o texto aceito é idêntico ao da versão limpa.</w:t>
       </w:r>
     </w:p>
     <w:p>

</xml_diff>